<commit_message>
Docs audit corrections and 0.6.7 screenshots
</commit_message>
<xml_diff>
--- a/DisplayHelp-0.6.7-User-Guide.docx
+++ b/DisplayHelp-0.6.7-User-Guide.docx
@@ -2,7 +2,7 @@
 <file path=word/document.xml><?xml version="1.0" encoding="utf-8"?>
 <w:document xmlns:w="http://schemas.openxmlformats.org/wordprocessingml/2006/main" xmlns:m="http://schemas.openxmlformats.org/officeDocument/2006/math" xmlns:r="http://schemas.openxmlformats.org/officeDocument/2006/relationships" xmlns:o="urn:schemas-microsoft-com:office:office" xmlns:v="urn:schemas-microsoft-com:vml" xmlns:w10="urn:schemas-microsoft-com:office:word" xmlns:a="http://schemas.openxmlformats.org/drawingml/2006/main" xmlns:pic="http://schemas.openxmlformats.org/drawingml/2006/picture" xmlns:wp="http://schemas.openxmlformats.org/drawingml/2006/wordprocessingDrawing">
   <w:body>
-    <w:bookmarkStart w:id="133" w:name="displayhelp-0.6.7-user-guide"/>
+    <w:bookmarkStart w:id="136" w:name="displayhelp-0.6.7-user-guide"/>
     <w:p>
       <w:pPr>
         <w:pStyle w:val="Heading1"/>
@@ -42,7 +42,7 @@
           <w:b/>
           <w:bCs/>
         </w:rPr>
-        <w:t xml:space="preserve">DisplayHelp 0.6.6 (120)</w:t>
+        <w:t xml:space="preserve">DisplayHelp 0.6.7 (121)</w:t>
       </w:r>
       <w:r>
         <w:t xml:space="preserve">. Feedback and suggestions are welcome.</w:t>
@@ -359,7 +359,7 @@
         <w:pStyle w:val="FirstParagraph"/>
       </w:pPr>
       <w:r>
-        <w:t xml:space="preserve">In 0.6.6, the menu fits its content up to 900 points tall, limited by the available screen height. Scroll inside it for any controls below the visible area.</w:t>
+        <w:t xml:space="preserve">Since 0.6.6, the menu fits its content up to 900 points tall, limited by the available screen height. Scroll inside it for any controls below the visible area.</w:t>
       </w:r>
     </w:p>
     <w:p>
@@ -522,7 +522,7 @@
               <w:pStyle w:val="Compact"/>
             </w:pPr>
             <w:r>
-              <w:t xml:space="preserve">Only the built-in panel is connected</w:t>
+              <w:t xml:space="preserve">Only one display is active</w:t>
             </w:r>
           </w:p>
         </w:tc>
@@ -608,7 +608,7 @@
         <w:t xml:space="preserve"> </w:t>
       </w:r>
       <w:r>
-        <w:t xml:space="preserve">When an external display is connected, use the button beneath Screen Layout to show matching numbers and names on each desktop for five seconds. Mirrored screens share the same numbered group. Labels let clicks pass through and disappear automatically, or when the display configuration changes. This does not change display settings.</w:t>
+        <w:t xml:space="preserve">When an external display is connected, use the button in the Screen Layout header to show matching numbers and names on each desktop for five seconds. Mirrored screens share the same numbered group. Labels let clicks pass through and disappear automatically, or when the display configuration changes. This does not change display settings.</w:t>
       </w:r>
     </w:p>
     <w:bookmarkEnd w:id="16"/>
@@ -687,7 +687,7 @@
         <w:t xml:space="preserve"> </w:t>
       </w:r>
       <w:r>
-        <w:t xml:space="preserve">below show the current 0.6.6 interface with isolated sample data. See</w:t>
+        <w:t xml:space="preserve">below: the menu captures show DisplayHelp 0.6.7 (121), captured on 2026-09-25 with isolated sample data; other captures are from 0.6.6 and show controls that are unchanged in 0.6.7. See</w:t>
       </w:r>
       <w:r>
         <w:t xml:space="preserve"> </w:t>
@@ -1228,7 +1228,7 @@
           <w:b/>
           <w:bCs/>
         </w:rPr>
-        <w:t xml:space="preserve">Set a favorite in 0.6.6:</w:t>
+        <w:t xml:space="preserve">Set a favorite (since 0.6.6):</w:t>
       </w:r>
     </w:p>
     <w:p>
@@ -1727,13 +1727,13 @@
         <w:t xml:space="preserve">app already remembers its settings.</w:t>
       </w:r>
     </w:p>
-    <w:bookmarkStart w:id="27" w:name="previous-and-default-setup-0.6.6"/>
+    <w:bookmarkStart w:id="27" w:name="previous-and-default-setup-since-0.6.6"/>
     <w:p>
       <w:pPr>
         <w:pStyle w:val="Heading3"/>
       </w:pPr>
       <w:r>
-        <w:t xml:space="preserve">Previous and Default Setup (0.6.6)</w:t>
+        <w:t xml:space="preserve">Previous and Default Setup (since 0.6.6)</w:t>
       </w:r>
     </w:p>
     <w:p>
@@ -2132,13 +2132,13 @@
       </w:r>
     </w:p>
     <w:bookmarkEnd w:id="27"/>
-    <w:bookmarkStart w:id="28" w:name="X6f0ce8e5a8b9d172be8d1a8b617098c7d72de01"/>
+    <w:bookmarkStart w:id="28" w:name="Xd065a788fd75e9e5014b897b9b14a77bd349b25"/>
     <w:p>
       <w:pPr>
         <w:pStyle w:val="Heading3"/>
       </w:pPr>
       <w:r>
-        <w:t xml:space="preserve">Identical monitors: limits and workaround (0.6.6)</w:t>
+        <w:t xml:space="preserve">Identical monitors: limits and workaround (since 0.6.6)</w:t>
       </w:r>
     </w:p>
     <w:p>
@@ -2952,7 +2952,7 @@
       </w:r>
     </w:p>
     <w:bookmarkEnd w:id="35"/>
-    <w:bookmarkStart w:id="79" w:name="display-cards"/>
+    <w:bookmarkStart w:id="82" w:name="display-cards"/>
     <w:p>
       <w:pPr>
         <w:pStyle w:val="Heading2"/>
@@ -2978,7 +2978,7 @@
           <wp:inline>
             <wp:extent cx="3067080" cy="6273573"/>
             <wp:effectExtent b="0" l="0" r="0" t="0"/>
-            <wp:docPr descr="DisplayHelp 0.6.6 display cards using sample displays and settings" title="" id="37" name="Picture"/>
+            <wp:docPr descr="DisplayHelp 0.6.7 display cards using sample displays and settings, with the HDCP state in the external status line" title="" id="37" name="Picture"/>
             <a:graphic>
               <a:graphicData uri="http://schemas.openxmlformats.org/drawingml/2006/picture">
                 <pic:pic>
@@ -3021,7 +3021,7 @@
         <w:pStyle w:val="ImageCaption"/>
       </w:pPr>
       <w:r>
-        <w:t xml:space="preserve">DisplayHelp 0.6.6 display cards using sample displays and settings</w:t>
+        <w:t xml:space="preserve">DisplayHelp 0.6.7 display cards using sample displays and settings, with the HDCP state in the external status line</w:t>
       </w:r>
     </w:p>
     <w:p>
@@ -3035,7 +3035,7 @@
         <w:t xml:space="preserve"> </w:t>
       </w:r>
       <w:r>
-        <w:t xml:space="preserve">rate. An orange dot indicates a different recommended mode or a low refresh rate. Controls depend on the</w:t>
+        <w:t xml:space="preserve">rate. A grey ⓘ icon instead of the green check indicates a different recommended mode or a low refresh rate. Controls depend on the</w:t>
       </w:r>
       <w:r>
         <w:t xml:space="preserve"> </w:t>
@@ -3291,31 +3291,49 @@
         <w:t xml:space="preserve"> </w:t>
       </w:r>
       <w:r>
-        <w:t xml:space="preserve">line such as</w:t>
-      </w:r>
-      <w:r>
-        <w:t xml:space="preserve"> </w:t>
-      </w:r>
-      <w:r>
-        <w:t xml:space="preserve">“60 Hz is available at 1920×1080 without HiDPI.”</w:t>
-      </w:r>
-      <w:r>
-        <w:t xml:space="preserve"> </w:t>
-      </w:r>
-      <w:r>
-        <w:t xml:space="preserve">appears under the status. Click it to apply that mode</w:t>
-      </w:r>
-      <w:r>
-        <w:t xml:space="preserve"> </w:t>
-      </w:r>
-      <w:r>
-        <w:t xml:space="preserve">through the usual preview. HiDPI sends the panel’s full pixel count over the cable, which is why an HDMI link often</w:t>
-      </w:r>
-      <w:r>
-        <w:t xml:space="preserve"> </w:t>
-      </w:r>
-      <w:r>
-        <w:t xml:space="preserve">holds it only at 30 Hz; the plain mode of the same size sends a quarter of the pixels and reaches 60 Hz.</w:t>
+        <w:t xml:space="preserve">line appears under the status:</w:t>
+      </w:r>
+      <w:r>
+        <w:t xml:space="preserve"> </w:t>
+      </w:r>
+      <w:r>
+        <w:t xml:space="preserve">“60 Hz is available at this size.”</w:t>
+      </w:r>
+      <w:r>
+        <w:t xml:space="preserve"> </w:t>
+      </w:r>
+      <w:r>
+        <w:t xml:space="preserve">when the same scaling reaches it, or</w:t>
+      </w:r>
+      <w:r>
+        <w:t xml:space="preserve"> </w:t>
+      </w:r>
+      <w:r>
+        <w:t xml:space="preserve">“60 Hz is</w:t>
+      </w:r>
+      <w:r>
+        <w:t xml:space="preserve"> </w:t>
+      </w:r>
+      <w:r>
+        <w:t xml:space="preserve">available at 1920×1080 without HiDPI.”</w:t>
+      </w:r>
+      <w:r>
+        <w:t xml:space="preserve"> </w:t>
+      </w:r>
+      <w:r>
+        <w:t xml:space="preserve">when only the plain mode does. Click it to switch, then confirm with Keep</w:t>
+      </w:r>
+      <w:r>
+        <w:t xml:space="preserve"> </w:t>
+      </w:r>
+      <w:r>
+        <w:t xml:space="preserve">Changes or Revert as for any mode change. HiDPI sends the panel’s full pixel count over the cable, which is why an</w:t>
+      </w:r>
+      <w:r>
+        <w:t xml:space="preserve"> </w:t>
+      </w:r>
+      <w:r>
+        <w:t xml:space="preserve">HDMI link often holds it only at 30 Hz; the plain mode of the same size sends a quarter of the pixels and reaches 60 Hz.</w:t>
       </w:r>
     </w:p>
     <w:p>
@@ -3331,13 +3349,13 @@
           <w:b/>
           <w:bCs/>
         </w:rPr>
-        <w:t xml:space="preserve">Dot.</w:t>
-      </w:r>
-      <w:r>
-        <w:t xml:space="preserve"> </w:t>
-      </w:r>
-      <w:r>
-        <w:t xml:space="preserve">Green: on a mode DisplayHelp would choose. Orange: not, which means pixel-exact 4K, a size the EDID does</w:t>
+        <w:t xml:space="preserve">Status icon.</w:t>
+      </w:r>
+      <w:r>
+        <w:t xml:space="preserve"> </w:t>
+      </w:r>
+      <w:r>
+        <w:t xml:space="preserve">A green check: on a mode DisplayHelp would choose. A grey ⓘ: not, which means pixel-exact 4K, a size the EDID does</w:t>
       </w:r>
       <w:r>
         <w:t xml:space="preserve"> </w:t>
@@ -3405,13 +3423,43 @@
         <w:t xml:space="preserve"> </w:t>
       </w:r>
       <w:r>
-        <w:t xml:space="preserve">each recommendation would pick, the identity key, and for external displays the HDCP state and reported topology</w:t>
-      </w:r>
-      <w:r>
-        <w:t xml:space="preserve"> </w:t>
-      </w:r>
-      <w:r>
-        <w:t xml:space="preserve">(0.6.7). Its</w:t>
+        <w:t xml:space="preserve">each recommendation would pick (</w:t>
+      </w:r>
+      <w:r>
+        <w:t xml:space="preserve">“already applied”</w:t>
+      </w:r>
+      <w:r>
+        <w:t xml:space="preserve"> </w:t>
+      </w:r>
+      <w:r>
+        <w:t xml:space="preserve">when nothing would change), the identity key, and for external</w:t>
+      </w:r>
+      <w:r>
+        <w:t xml:space="preserve"> </w:t>
+      </w:r>
+      <w:r>
+        <w:t xml:space="preserve">displays the HDCP state and reported topology (</w:t>
+      </w:r>
+      <w:r>
+        <w:t xml:space="preserve">“not checked”</w:t>
+      </w:r>
+      <w:r>
+        <w:t xml:space="preserve"> </w:t>
+      </w:r>
+      <w:r>
+        <w:t xml:space="preserve">or</w:t>
+      </w:r>
+      <w:r>
+        <w:t xml:space="preserve"> </w:t>
+      </w:r>
+      <w:r>
+        <w:t xml:space="preserve">“checking…”</w:t>
+      </w:r>
+      <w:r>
+        <w:t xml:space="preserve"> </w:t>
+      </w:r>
+      <w:r>
+        <w:t xml:space="preserve">until a reading exists). Its</w:t>
       </w:r>
       <w:r>
         <w:t xml:space="preserve"> </w:t>
@@ -3882,7 +3930,7 @@
         <w:t xml:space="preserve"> </w:t>
       </w:r>
       <w:r>
-        <w:t xml:space="preserve">the available filtered modes. The orange dot can remain even when no faster recommendation is available.</w:t>
+        <w:t xml:space="preserve">the available filtered modes. The grey ⓘ can remain even when no faster recommendation is available.</w:t>
       </w:r>
       <w:r>
         <w:t xml:space="preserve"> </w:t>
@@ -3932,7 +3980,13 @@
         <w:t xml:space="preserve"> </w:t>
       </w:r>
       <w:r>
-        <w:t xml:space="preserve">cannot render that size, the closest guaranteed size at or above it, preferring the HiDPI variant.</w:t>
+        <w:t xml:space="preserve">cannot render that size, a size with the same aspect ratio; otherwise the closest guaranteed size at or above it</w:t>
+      </w:r>
+      <w:r>
+        <w:t xml:space="preserve"> </w:t>
+      </w:r>
+      <w:r>
+        <w:t xml:space="preserve">(HiDPI where available); otherwise the Best for Display choice.</w:t>
       </w:r>
     </w:p>
     <w:p>
@@ -4763,7 +4817,7 @@
       </w:r>
     </w:p>
     <w:bookmarkEnd w:id="68"/>
-    <w:bookmarkStart w:id="69" w:name="check-hdcp-externals"/>
+    <w:bookmarkStart w:id="72" w:name="check-hdcp-externals"/>
     <w:p>
       <w:pPr>
         <w:pStyle w:val="Heading3"/>
@@ -4797,7 +4851,13 @@
         <w:t xml:space="preserve"> </w:t>
       </w:r>
       <w:r>
-        <w:t xml:space="preserve">attached when the app opens, and shows it at the end of the card’s status line.</w:t>
+        <w:t xml:space="preserve">attached when the app opens, and shows it at the end of the card’s status line. If macOS answers Negotiating, it</w:t>
+      </w:r>
+      <w:r>
+        <w:t xml:space="preserve"> </w:t>
+      </w:r>
+      <w:r>
+        <w:t xml:space="preserve">reads once more after five seconds so the line settles.</w:t>
       </w:r>
       <w:r>
         <w:t xml:space="preserve"> </w:t>
@@ -4813,62 +4873,19 @@
         <w:t xml:space="preserve"> </w:t>
       </w:r>
       <w:r>
-        <w:t xml:space="preserve">reads it again, for example after playback starts or stops. The reading is bounded to a few seconds, never runs on</w:t>
-      </w:r>
-      <w:r>
-        <w:t xml:space="preserve"> </w:t>
-      </w:r>
-      <w:r>
-        <w:t xml:space="preserve">the periodic refresh, and never changes or negotiates protection.</w:t>
-      </w:r>
-    </w:p>
-    <w:p>
-      <w:pPr>
-        <w:pStyle w:val="BodyText"/>
-      </w:pPr>
-      <w:r>
-        <w:t xml:space="preserve">The result under the button reads like</w:t>
-      </w:r>
-      <w:r>
-        <w:t xml:space="preserve"> </w:t>
-      </w:r>
-      <w:r>
-        <w:t xml:space="preserve">“macOS reports HDCP2 · Protected · Encrypted. Checked 10:23 PM. This is the</w:t>
-      </w:r>
-      <w:r>
-        <w:t xml:space="preserve"> </w:t>
-      </w:r>
-      <w:r>
-        <w:t xml:space="preserve">connection state; protected playback has not been tested.”</w:t>
-      </w:r>
-      <w:r>
-        <w:t xml:space="preserve"> </w:t>
-      </w:r>
-      <w:r>
-        <w:t xml:space="preserve">The protocol family is what macOS reports:</w:t>
-      </w:r>
-      <w:r>
-        <w:t xml:space="preserve"> </w:t>
-      </w:r>
-      <w:r>
-        <w:rPr>
-          <w:b/>
-          <w:bCs/>
-        </w:rPr>
-        <w:t xml:space="preserve">HDCP1</w:t>
-      </w:r>
-      <w:r>
-        <w:t xml:space="preserve">,</w:t>
-      </w:r>
-      <w:r>
-        <w:t xml:space="preserve"> </w:t>
-      </w:r>
-      <w:r>
-        <w:rPr>
-          <w:b/>
-          <w:bCs/>
-        </w:rPr>
-        <w:t xml:space="preserve">HDCP2</w:t>
+        <w:t xml:space="preserve">reads it again, for example</w:t>
+      </w:r>
+      <w:r>
+        <w:t xml:space="preserve"> </w:t>
+      </w:r>
+      <w:r>
+        <w:t xml:space="preserve">after playback starts or stops; until a reading exists the row says</w:t>
+      </w:r>
+      <w:r>
+        <w:t xml:space="preserve"> </w:t>
+      </w:r>
+      <w:r>
+        <w:t xml:space="preserve">“not checked”</w:t>
       </w:r>
       <w:r>
         <w:t xml:space="preserve"> </w:t>
@@ -4880,174 +4897,22 @@
         <w:t xml:space="preserve"> </w:t>
       </w:r>
       <w:r>
-        <w:rPr>
-          <w:b/>
-          <w:bCs/>
-        </w:rPr>
-        <w:t xml:space="preserve">None</w:t>
-      </w:r>
-      <w:r>
-        <w:t xml:space="preserve">. macOS does not distinguish 1.4 from earlier 1.x, or 2.2 from 2.3.</w:t>
-      </w:r>
-    </w:p>
-    <w:p>
-      <w:pPr>
-        <w:pStyle w:val="BodyText"/>
-      </w:pPr>
-      <w:r>
-        <w:t xml:space="preserve">When the DisplayPort receiver reports it, a second sentence describes the chain: whether a repeater is present, the</w:t>
-      </w:r>
-      <w:r>
-        <w:t xml:space="preserve"> </w:t>
-      </w:r>
-      <w:r>
-        <w:t xml:space="preserve">reported device count and depth, and any limit flags. These are the receiver’s own observations. They do not name a</w:t>
-      </w:r>
-      <w:r>
-        <w:t xml:space="preserve"> </w:t>
-      </w:r>
-      <w:r>
-        <w:t xml:space="preserve">vendor or a failing device, and an unreadable register is stated as unknown rather than reported as a result.</w:t>
-      </w:r>
-    </w:p>
-    <w:p>
-      <w:pPr>
-        <w:pStyle w:val="BodyText"/>
-      </w:pPr>
-      <w:r>
-        <w:rPr>
-          <w:b/>
-          <w:bCs/>
-        </w:rPr>
-        <w:t xml:space="preserve">Unavailable</w:t>
-      </w:r>
-      <w:r>
-        <w:t xml:space="preserve"> </w:t>
-      </w:r>
-      <w:r>
-        <w:t xml:space="preserve">with a reason means the reading could not be made: a built-in display, an ambiguous match between</w:t>
-      </w:r>
-      <w:r>
-        <w:t xml:space="preserve"> </w:t>
-      </w:r>
-      <w:r>
-        <w:t xml:space="preserve">identical monitors, a macOS version without the interface, a refused query, or no answer within the time limit. It is</w:t>
-      </w:r>
-      <w:r>
-        <w:t xml:space="preserve"> </w:t>
-      </w:r>
-      <w:r>
-        <w:t xml:space="preserve">not a verdict on the display. The result is also included in</w:t>
-      </w:r>
-      <w:r>
-        <w:t xml:space="preserve"> </w:t>
-      </w:r>
-      <w:r>
-        <w:rPr>
-          <w:b/>
-          <w:bCs/>
-        </w:rPr>
-        <w:t xml:space="preserve">Copy Diagnostics</w:t>
-      </w:r>
-      <w:r>
-        <w:t xml:space="preserve"> </w:t>
-      </w:r>
-      <w:r>
-        <w:t xml:space="preserve">with the raw values.</w:t>
-      </w:r>
-    </w:p>
-    <w:bookmarkEnd w:id="69"/>
-    <w:bookmarkStart w:id="70" w:name="brightness-contrast-monitor-volume"/>
-    <w:p>
-      <w:pPr>
-        <w:pStyle w:val="Heading3"/>
-      </w:pPr>
-      <w:r>
-        <w:t xml:space="preserve">Brightness, Contrast, Monitor Volume</w:t>
-      </w:r>
-    </w:p>
-    <w:p>
-      <w:pPr>
-        <w:pStyle w:val="FirstParagraph"/>
-      </w:pPr>
-      <w:r>
-        <w:t xml:space="preserve">The built-in panel shows Brightness when macOS returns a readable value. External displays get the sliders their hardware answers to over DDC/CI.</w:t>
-      </w:r>
-      <w:r>
-        <w:t xml:space="preserve"> </w:t>
-      </w:r>
-      <w:r>
-        <w:t xml:space="preserve">On Apple Silicon, USB-C and DisplayPort can carry DDC, but support varies by monitor and adapter. HDMI and</w:t>
-      </w:r>
-      <w:r>
-        <w:t xml:space="preserve"> </w:t>
-      </w:r>
-      <w:r>
-        <w:t xml:space="preserve">some TVs may not expose usable DDC controls. The built-in HDMI port on Apple silicon laptops reads the display’s</w:t>
-      </w:r>
-      <w:r>
-        <w:t xml:space="preserve"> </w:t>
-      </w:r>
-      <w:r>
-        <w:t xml:space="preserve">identity but refuses DDC/CI commands, so those sliders stay unavailable on that port even when the same monitor</w:t>
-      </w:r>
-      <w:r>
-        <w:t xml:space="preserve"> </w:t>
-      </w:r>
-      <w:r>
-        <w:t xml:space="preserve">answers over USB-C.</w:t>
-      </w:r>
-      <w:r>
-        <w:t xml:space="preserve"> </w:t>
-      </w:r>
-      <w:r>
-        <w:t xml:space="preserve">An absent slider means there is no usable reading, not necessarily that the monitor can never support it.</w:t>
-      </w:r>
-      <w:r>
-        <w:t xml:space="preserve"> </w:t>
-      </w:r>
-      <w:r>
-        <w:t xml:space="preserve">The card’s unavailable-control explanations describe known limitations without guessing the cause. DDC is not</w:t>
-      </w:r>
-      <w:r>
-        <w:t xml:space="preserve"> </w:t>
-      </w:r>
-      <w:r>
-        <w:t xml:space="preserve">implemented on Intel Macs, and ambiguous hardware matches disable DDC to avoid changing the wrong monitor.</w:t>
-      </w:r>
-      <w:r>
-        <w:t xml:space="preserve"> </w:t>
-      </w:r>
-      <w:r>
-        <w:t xml:space="preserve">Values are remembered per display after readback verification.</w:t>
-      </w:r>
-    </w:p>
-    <w:bookmarkEnd w:id="70"/>
-    <w:bookmarkStart w:id="71" w:name="underscan-externals"/>
-    <w:p>
-      <w:pPr>
-        <w:pStyle w:val="Heading3"/>
-      </w:pPr>
-      <w:r>
-        <w:t xml:space="preserve">Underscan (externals)</w:t>
-      </w:r>
-    </w:p>
-    <w:p>
-      <w:pPr>
-        <w:pStyle w:val="FirstParagraph"/>
-      </w:pPr>
-      <w:r>
-        <w:t xml:space="preserve">A slider that shrinks the picture for projectors that crop the edges. Shown when the display supports it. Remembered.</w:t>
-      </w:r>
-    </w:p>
-    <w:bookmarkEnd w:id="71"/>
-    <w:bookmarkStart w:id="78" w:name="position-extend-mode-only"/>
-    <w:p>
-      <w:pPr>
-        <w:pStyle w:val="Heading3"/>
-      </w:pPr>
-      <w:r>
-        <w:t xml:space="preserve">Position (extend mode only)</w:t>
+        <w:t xml:space="preserve">“checking…”</w:t>
+      </w:r>
+      <w:r>
+        <w:t xml:space="preserve">. Each reading is</w:t>
+      </w:r>
+      <w:r>
+        <w:t xml:space="preserve"> </w:t>
+      </w:r>
+      <w:r>
+        <w:t xml:space="preserve">limited to three seconds for the status plus three for the optional topology, never runs on the periodic refresh,</w:t>
+      </w:r>
+      <w:r>
+        <w:t xml:space="preserve"> </w:t>
+      </w:r>
+      <w:r>
+        <w:t xml:space="preserve">and never changes or negotiates protection.</w:t>
       </w:r>
     </w:p>
     <w:p>
@@ -5057,20 +4922,303 @@
       <w:r>
         <w:drawing>
           <wp:inline>
-            <wp:extent cx="2619390" cy="1483816"/>
+            <wp:extent cx="3286170" cy="1000138"/>
             <wp:effectExtent b="0" l="0" r="0" t="0"/>
-            <wp:docPr descr="DisplayHelp 0.6.6: Relative screen position choices" title="" id="73" name="Picture"/>
+            <wp:docPr descr="DisplayHelp 0.6.7: the HDCP row under More Controls with a sample HDCP2 reading and reported topology" title="" id="70" name="Picture"/>
             <a:graphic>
               <a:graphicData uri="http://schemas.openxmlformats.org/drawingml/2006/picture">
                 <pic:pic>
                   <pic:nvPicPr>
-                    <pic:cNvPr descr="/Users/helpdesk/Developer/GitHub/DisplayHelp/docs/images/position.png" id="74" name="Picture"/>
+                    <pic:cNvPr descr="/Users/helpdesk/Developer/GitHub/DisplayHelp/docs/images/check-hdcp.png" id="71" name="Picture"/>
                     <pic:cNvPicPr>
                       <a:picLocks noChangeArrowheads="1" noChangeAspect="1"/>
                     </pic:cNvPicPr>
                   </pic:nvPicPr>
                   <pic:blipFill>
-                    <a:blip r:embed="rId72"/>
+                    <a:blip r:embed="rId69"/>
+                    <a:stretch>
+                      <a:fillRect/>
+                    </a:stretch>
+                  </pic:blipFill>
+                  <pic:spPr bwMode="auto">
+                    <a:xfrm>
+                      <a:off x="0" y="0"/>
+                      <a:ext cx="3286170" cy="1000138"/>
+                    </a:xfrm>
+                    <a:prstGeom prst="rect">
+                      <a:avLst/>
+                    </a:prstGeom>
+                    <a:noFill/>
+                    <a:ln w="9525">
+                      <a:noFill/>
+                      <a:headEnd/>
+                      <a:tailEnd/>
+                    </a:ln>
+                  </pic:spPr>
+                </pic:pic>
+              </a:graphicData>
+            </a:graphic>
+          </wp:inline>
+        </w:drawing>
+      </w:r>
+    </w:p>
+    <w:p>
+      <w:pPr>
+        <w:pStyle w:val="ImageCaption"/>
+      </w:pPr>
+      <w:r>
+        <w:t xml:space="preserve">DisplayHelp 0.6.7: the HDCP row under More Controls with a sample HDCP2 reading and reported topology</w:t>
+      </w:r>
+    </w:p>
+    <w:p>
+      <w:pPr>
+        <w:pStyle w:val="BodyText"/>
+      </w:pPr>
+      <w:r>
+        <w:t xml:space="preserve">The result under the button reads like</w:t>
+      </w:r>
+      <w:r>
+        <w:t xml:space="preserve"> </w:t>
+      </w:r>
+      <w:r>
+        <w:t xml:space="preserve">“macOS reports HDCP2 · Protected · Encrypted. Checked 10:23 PM. This is the</w:t>
+      </w:r>
+      <w:r>
+        <w:t xml:space="preserve"> </w:t>
+      </w:r>
+      <w:r>
+        <w:t xml:space="preserve">connection state; protected playback has not been tested.”</w:t>
+      </w:r>
+      <w:r>
+        <w:t xml:space="preserve"> </w:t>
+      </w:r>
+      <w:r>
+        <w:t xml:space="preserve">The protocol family is what macOS reports:</w:t>
+      </w:r>
+      <w:r>
+        <w:t xml:space="preserve"> </w:t>
+      </w:r>
+      <w:r>
+        <w:rPr>
+          <w:b/>
+          <w:bCs/>
+        </w:rPr>
+        <w:t xml:space="preserve">HDCP1</w:t>
+      </w:r>
+      <w:r>
+        <w:t xml:space="preserve">,</w:t>
+      </w:r>
+      <w:r>
+        <w:t xml:space="preserve"> </w:t>
+      </w:r>
+      <w:r>
+        <w:rPr>
+          <w:b/>
+          <w:bCs/>
+        </w:rPr>
+        <w:t xml:space="preserve">HDCP2</w:t>
+      </w:r>
+      <w:r>
+        <w:t xml:space="preserve"> </w:t>
+      </w:r>
+      <w:r>
+        <w:t xml:space="preserve">or</w:t>
+      </w:r>
+      <w:r>
+        <w:t xml:space="preserve"> </w:t>
+      </w:r>
+      <w:r>
+        <w:rPr>
+          <w:b/>
+          <w:bCs/>
+        </w:rPr>
+        <w:t xml:space="preserve">None</w:t>
+      </w:r>
+      <w:r>
+        <w:t xml:space="preserve">. macOS does not distinguish 1.4 from earlier 1.x, or 2.2 from 2.3.</w:t>
+      </w:r>
+    </w:p>
+    <w:p>
+      <w:pPr>
+        <w:pStyle w:val="BodyText"/>
+      </w:pPr>
+      <w:r>
+        <w:t xml:space="preserve">On a DisplayPort connection a second sentence describes the chain: whether a repeater is reported and, for an HDCP 2</w:t>
+      </w:r>
+      <w:r>
+        <w:t xml:space="preserve"> </w:t>
+      </w:r>
+      <w:r>
+        <w:t xml:space="preserve">repeater, the reported device count and depth and any limit flags. These are the receiver’s own observations. They do not name a</w:t>
+      </w:r>
+      <w:r>
+        <w:t xml:space="preserve"> </w:t>
+      </w:r>
+      <w:r>
+        <w:t xml:space="preserve">vendor or a failing device, and an unreadable register is stated as unknown rather than reported as a result.</w:t>
+      </w:r>
+    </w:p>
+    <w:p>
+      <w:pPr>
+        <w:pStyle w:val="BodyText"/>
+      </w:pPr>
+      <w:r>
+        <w:rPr>
+          <w:b/>
+          <w:bCs/>
+        </w:rPr>
+        <w:t xml:space="preserve">Unavailable</w:t>
+      </w:r>
+      <w:r>
+        <w:t xml:space="preserve"> </w:t>
+      </w:r>
+      <w:r>
+        <w:t xml:space="preserve">with a reason means the reading could not be made: no display service matched this monitor (identical</w:t>
+      </w:r>
+      <w:r>
+        <w:t xml:space="preserve"> </w:t>
+      </w:r>
+      <w:r>
+        <w:t xml:space="preserve">monitors that cannot be told apart, or an Intel Mac), a macOS version without the interface, a refused query, a</w:t>
+      </w:r>
+      <w:r>
+        <w:t xml:space="preserve"> </w:t>
+      </w:r>
+      <w:r>
+        <w:t xml:space="preserve">previous check still waiting for macOS, or no answer within the time limit. It is not a verdict on the display. The result is also included in</w:t>
+      </w:r>
+      <w:r>
+        <w:t xml:space="preserve"> </w:t>
+      </w:r>
+      <w:r>
+        <w:rPr>
+          <w:b/>
+          <w:bCs/>
+        </w:rPr>
+        <w:t xml:space="preserve">Copy Diagnostics</w:t>
+      </w:r>
+      <w:r>
+        <w:t xml:space="preserve"> </w:t>
+      </w:r>
+      <w:r>
+        <w:t xml:space="preserve">with the raw values.</w:t>
+      </w:r>
+    </w:p>
+    <w:bookmarkEnd w:id="72"/>
+    <w:bookmarkStart w:id="73" w:name="brightness-contrast-monitor-volume"/>
+    <w:p>
+      <w:pPr>
+        <w:pStyle w:val="Heading3"/>
+      </w:pPr>
+      <w:r>
+        <w:t xml:space="preserve">Brightness, Contrast, Monitor Volume</w:t>
+      </w:r>
+    </w:p>
+    <w:p>
+      <w:pPr>
+        <w:pStyle w:val="FirstParagraph"/>
+      </w:pPr>
+      <w:r>
+        <w:t xml:space="preserve">The built-in panel shows Brightness when macOS returns a readable value. External displays get the sliders their hardware answers to over DDC/CI.</w:t>
+      </w:r>
+      <w:r>
+        <w:t xml:space="preserve"> </w:t>
+      </w:r>
+      <w:r>
+        <w:t xml:space="preserve">On Apple Silicon, USB-C and DisplayPort can carry DDC, but support varies by monitor and adapter. HDMI and</w:t>
+      </w:r>
+      <w:r>
+        <w:t xml:space="preserve"> </w:t>
+      </w:r>
+      <w:r>
+        <w:t xml:space="preserve">some TVs may not expose usable DDC controls. The built-in HDMI port on Apple silicon laptops reads the display’s</w:t>
+      </w:r>
+      <w:r>
+        <w:t xml:space="preserve"> </w:t>
+      </w:r>
+      <w:r>
+        <w:t xml:space="preserve">identity but refuses DDC/CI commands, so those sliders stay unavailable on that port even when the same monitor</w:t>
+      </w:r>
+      <w:r>
+        <w:t xml:space="preserve"> </w:t>
+      </w:r>
+      <w:r>
+        <w:t xml:space="preserve">answers over USB-C.</w:t>
+      </w:r>
+      <w:r>
+        <w:t xml:space="preserve"> </w:t>
+      </w:r>
+      <w:r>
+        <w:t xml:space="preserve">An absent slider means there is no usable reading, not necessarily that the monitor can never support it.</w:t>
+      </w:r>
+      <w:r>
+        <w:t xml:space="preserve"> </w:t>
+      </w:r>
+      <w:r>
+        <w:t xml:space="preserve">The card’s unavailable-control explanations describe known limitations without guessing the cause. DDC is not</w:t>
+      </w:r>
+      <w:r>
+        <w:t xml:space="preserve"> </w:t>
+      </w:r>
+      <w:r>
+        <w:t xml:space="preserve">implemented on Intel Macs, and ambiguous hardware matches disable DDC to avoid changing the wrong monitor.</w:t>
+      </w:r>
+      <w:r>
+        <w:t xml:space="preserve"> </w:t>
+      </w:r>
+      <w:r>
+        <w:t xml:space="preserve">Values are remembered per display after readback verification.</w:t>
+      </w:r>
+    </w:p>
+    <w:bookmarkEnd w:id="73"/>
+    <w:bookmarkStart w:id="74" w:name="underscan-externals"/>
+    <w:p>
+      <w:pPr>
+        <w:pStyle w:val="Heading3"/>
+      </w:pPr>
+      <w:r>
+        <w:t xml:space="preserve">Underscan (externals)</w:t>
+      </w:r>
+    </w:p>
+    <w:p>
+      <w:pPr>
+        <w:pStyle w:val="FirstParagraph"/>
+      </w:pPr>
+      <w:r>
+        <w:t xml:space="preserve">A slider that shrinks the picture for projectors that crop the edges. Shown when the display supports it. Remembered.</w:t>
+      </w:r>
+    </w:p>
+    <w:bookmarkEnd w:id="74"/>
+    <w:bookmarkStart w:id="81" w:name="position-extend-mode-only"/>
+    <w:p>
+      <w:pPr>
+        <w:pStyle w:val="Heading3"/>
+      </w:pPr>
+      <w:r>
+        <w:t xml:space="preserve">Position (extend mode only)</w:t>
+      </w:r>
+    </w:p>
+    <w:p>
+      <w:pPr>
+        <w:pStyle w:val="CaptionedFigure"/>
+      </w:pPr>
+      <w:r>
+        <w:drawing>
+          <wp:inline>
+            <wp:extent cx="2619390" cy="1483816"/>
+            <wp:effectExtent b="0" l="0" r="0" t="0"/>
+            <wp:docPr descr="DisplayHelp 0.6.6: Relative screen position choices" title="" id="76" name="Picture"/>
+            <a:graphic>
+              <a:graphicData uri="http://schemas.openxmlformats.org/drawingml/2006/picture">
+                <pic:pic>
+                  <pic:nvPicPr>
+                    <pic:cNvPr descr="/Users/helpdesk/Developer/GitHub/DisplayHelp/docs/images/position.png" id="77" name="Picture"/>
+                    <pic:cNvPicPr>
+                      <a:picLocks noChangeArrowheads="1" noChangeAspect="1"/>
+                    </pic:cNvPicPr>
+                  </pic:nvPicPr>
+                  <pic:blipFill>
+                    <a:blip r:embed="rId75"/>
                     <a:stretch>
                       <a:fillRect/>
                     </a:stretch>
@@ -5114,18 +5262,18 @@
           <wp:inline>
             <wp:extent cx="914400" cy="723900"/>
             <wp:effectExtent b="0" l="0" r="0" t="0"/>
-            <wp:docPr descr="DisplayHelp 0.6.6: Edge and center alignment choices" title="" id="76" name="Picture"/>
+            <wp:docPr descr="DisplayHelp 0.6.6: Edge and center alignment choices" title="" id="79" name="Picture"/>
             <a:graphic>
               <a:graphicData uri="http://schemas.openxmlformats.org/drawingml/2006/picture">
                 <pic:pic>
                   <pic:nvPicPr>
-                    <pic:cNvPr descr="/Users/helpdesk/Developer/GitHub/DisplayHelp/docs/images/position-alignment.png" id="77" name="Picture"/>
+                    <pic:cNvPr descr="/Users/helpdesk/Developer/GitHub/DisplayHelp/docs/images/position-alignment.png" id="80" name="Picture"/>
                     <pic:cNvPicPr>
                       <a:picLocks noChangeArrowheads="1" noChangeAspect="1"/>
                     </pic:cNvPicPr>
                   </pic:nvPicPr>
                   <pic:blipFill>
-                    <a:blip r:embed="rId75"/>
+                    <a:blip r:embed="rId78"/>
                     <a:stretch>
                       <a:fillRect/>
                     </a:stretch>
@@ -5330,9 +5478,9 @@
         <w:t xml:space="preserve">and still reports rotation.</w:t>
       </w:r>
     </w:p>
-    <w:bookmarkEnd w:id="78"/>
-    <w:bookmarkEnd w:id="79"/>
-    <w:bookmarkStart w:id="80" w:name="when-something-is-refused"/>
+    <w:bookmarkEnd w:id="81"/>
+    <w:bookmarkEnd w:id="82"/>
+    <w:bookmarkStart w:id="83" w:name="when-something-is-refused"/>
     <w:p>
       <w:pPr>
         <w:pStyle w:val="Heading2"/>
@@ -5358,7 +5506,7 @@
         <w:t xml:space="preserve"> </w:t>
       </w:r>
       <w:r>
-        <w:t xml:space="preserve">“Couldn’t set 1920×1080 on SAMSUNG: display configuration failed (CGError 1001)”</w:t>
+        <w:t xml:space="preserve">“Couldn’t set 1920×1080 60Hz on SAMSUNG: display configuration failed (CGError 1001)”</w:t>
       </w:r>
       <w:r>
         <w:t xml:space="preserve">. Next to it,</w:t>
@@ -5404,16 +5552,32 @@
       </w:r>
       <w:r>
         <w:rPr>
+          <w:b/>
+          <w:bCs/>
+        </w:rPr>
+        <w:t xml:space="preserve">Change Failed</w:t>
+      </w:r>
+      <w:r>
+        <w:t xml:space="preserve"> </w:t>
+      </w:r>
+      <w:r>
+        <w:t xml:space="preserve">(</w:t>
+      </w:r>
+      <w:r>
+        <w:rPr>
           <w:rStyle w:val="VerbatimChar"/>
         </w:rPr>
         <w:t xml:space="preserve">applyFailed</w:t>
       </w:r>
       <w:r>
-        <w:t xml:space="preserve">.</w:t>
-      </w:r>
-    </w:p>
-    <w:bookmarkEnd w:id="80"/>
-    <w:bookmarkStart w:id="107" w:name="fixes"/>
+        <w:t xml:space="preserve"> </w:t>
+      </w:r>
+      <w:r>
+        <w:t xml:space="preserve">in the history file and diagnostics).</w:t>
+      </w:r>
+    </w:p>
+    <w:bookmarkEnd w:id="83"/>
+    <w:bookmarkStart w:id="110" w:name="fixes"/>
     <w:p>
       <w:pPr>
         <w:pStyle w:val="Heading2"/>
@@ -5446,7 +5610,7 @@
         <w:t xml:space="preserve">for these actions, Detect Displays, Recent Events and Copy Diagnostics.</w:t>
       </w:r>
     </w:p>
-    <w:bookmarkStart w:id="84" w:name="reset-display-preferences"/>
+    <w:bookmarkStart w:id="87" w:name="reset-display-preferences"/>
     <w:p>
       <w:pPr>
         <w:pStyle w:val="Heading3"/>
@@ -5550,18 +5714,18 @@
           <wp:inline>
             <wp:extent cx="2476469" cy="3505156"/>
             <wp:effectExtent b="0" l="0" r="0" t="0"/>
-            <wp:docPr descr="Reset confirmation in 0.6.6: display settings are cleared while ColorSync profiles are preserved" title="" id="82" name="Picture"/>
+            <wp:docPr descr="Reset confirmation in 0.6.6: display settings are cleared while ColorSync profiles are preserved" title="" id="85" name="Picture"/>
             <a:graphic>
               <a:graphicData uri="http://schemas.openxmlformats.org/drawingml/2006/picture">
                 <pic:pic>
                   <pic:nvPicPr>
-                    <pic:cNvPr descr="/Users/helpdesk/Developer/GitHub/DisplayHelp/docs/images/reset-confirmation.png" id="83" name="Picture"/>
+                    <pic:cNvPr descr="/Users/helpdesk/Developer/GitHub/DisplayHelp/docs/images/reset-confirmation.png" id="86" name="Picture"/>
                     <pic:cNvPicPr>
                       <a:picLocks noChangeArrowheads="1" noChangeAspect="1"/>
                     </pic:cNvPicPr>
                   </pic:nvPicPr>
                   <pic:blipFill>
-                    <a:blip r:embed="rId81"/>
+                    <a:blip r:embed="rId84"/>
                     <a:stretch>
                       <a:fillRect/>
                     </a:stretch>
@@ -5596,8 +5760,8 @@
         <w:t xml:space="preserve">Reset confirmation in 0.6.6: display settings are cleared while ColorSync profiles are preserved</w:t>
       </w:r>
     </w:p>
-    <w:bookmarkEnd w:id="84"/>
-    <w:bookmarkStart w:id="98" w:name="custom-fixes"/>
+    <w:bookmarkEnd w:id="87"/>
+    <w:bookmarkStart w:id="101" w:name="custom-fixes"/>
     <w:p>
       <w:pPr>
         <w:pStyle w:val="Heading3"/>
@@ -5659,7 +5823,7 @@
       <w:r>
         <w:t xml:space="preserve"> </w:t>
       </w:r>
-      <w:hyperlink r:id="rId85">
+      <w:hyperlink r:id="rId88">
         <w:r>
           <w:rPr>
             <w:rStyle w:val="Hyperlink"/>
@@ -5701,18 +5865,18 @@
           <wp:inline>
             <wp:extent cx="4190969" cy="1862653"/>
             <wp:effectExtent b="0" l="0" r="0" t="0"/>
-            <wp:docPr descr="Example scripts shown in an isolated capture folder; install them in your own Custom Fixes folder" title="" id="87" name="Picture"/>
+            <wp:docPr descr="Example scripts shown in an isolated capture folder; install them in your own Custom Fixes folder" title="" id="90" name="Picture"/>
             <a:graphic>
               <a:graphicData uri="http://schemas.openxmlformats.org/drawingml/2006/picture">
                 <pic:pic>
                   <pic:nvPicPr>
-                    <pic:cNvPr descr="/Users/helpdesk/Developer/GitHub/DisplayHelp/docs/images/custom-fixes-folder.png" id="88" name="Picture"/>
+                    <pic:cNvPr descr="/Users/helpdesk/Developer/GitHub/DisplayHelp/docs/images/custom-fixes-folder.png" id="91" name="Picture"/>
                     <pic:cNvPicPr>
                       <a:picLocks noChangeArrowheads="1" noChangeAspect="1"/>
                     </pic:cNvPicPr>
                   </pic:nvPicPr>
                   <pic:blipFill>
-                    <a:blip r:embed="rId86"/>
+                    <a:blip r:embed="rId89"/>
                     <a:stretch>
                       <a:fillRect/>
                     </a:stretch>
@@ -5780,18 +5944,18 @@
           <wp:inline>
             <wp:extent cx="4190969" cy="3857596"/>
             <wp:effectExtent b="0" l="0" r="0" t="0"/>
-            <wp:docPr descr="Custom Fixes menu with the harmless demo and optional Restart Dock action" title="" id="90" name="Picture"/>
+            <wp:docPr descr="Custom Fixes menu with the harmless demo and optional Restart Dock action" title="" id="93" name="Picture"/>
             <a:graphic>
               <a:graphicData uri="http://schemas.openxmlformats.org/drawingml/2006/picture">
                 <pic:pic>
                   <pic:nvPicPr>
-                    <pic:cNvPr descr="/Users/helpdesk/Developer/GitHub/DisplayHelp/docs/images/custom-fixes-menu.png" id="91" name="Picture"/>
+                    <pic:cNvPr descr="/Users/helpdesk/Developer/GitHub/DisplayHelp/docs/images/custom-fixes-menu.png" id="94" name="Picture"/>
                     <pic:cNvPicPr>
                       <a:picLocks noChangeArrowheads="1" noChangeAspect="1"/>
                     </pic:cNvPicPr>
                   </pic:nvPicPr>
                   <pic:blipFill>
-                    <a:blip r:embed="rId89"/>
+                    <a:blip r:embed="rId92"/>
                     <a:stretch>
                       <a:fillRect/>
                     </a:stretch>
@@ -6040,7 +6204,7 @@
         <w:t xml:space="preserve"> </w:t>
       </w:r>
       <w:r>
-        <w:t xml:space="preserve">“exit ‹code›, ‹seconds›s. ‹last line of output›”</w:t>
+        <w:t xml:space="preserve">“‹name›: Exit code ‹code›, ‹seconds› seconds. ‹last line of output›”</w:t>
       </w:r>
       <w:r>
         <w:t xml:space="preserve"> </w:t>
@@ -6097,18 +6261,18 @@
           <wp:inline>
             <wp:extent cx="2476469" cy="2533618"/>
             <wp:effectExtent b="0" l="0" r="0" t="0"/>
-            <wp:docPr descr="Confirmation for the harmless Custom Fixes demo" title="" id="93" name="Picture"/>
+            <wp:docPr descr="Confirmation for the harmless Custom Fixes demo" title="" id="96" name="Picture"/>
             <a:graphic>
               <a:graphicData uri="http://schemas.openxmlformats.org/drawingml/2006/picture">
                 <pic:pic>
                   <pic:nvPicPr>
-                    <pic:cNvPr descr="/Users/helpdesk/Developer/GitHub/DisplayHelp/docs/images/custom-fixes-confirmation.png" id="94" name="Picture"/>
+                    <pic:cNvPr descr="/Users/helpdesk/Developer/GitHub/DisplayHelp/docs/images/custom-fixes-confirmation.png" id="97" name="Picture"/>
                     <pic:cNvPicPr>
                       <a:picLocks noChangeArrowheads="1" noChangeAspect="1"/>
                     </pic:cNvPicPr>
                   </pic:nvPicPr>
                   <pic:blipFill>
-                    <a:blip r:embed="rId92"/>
+                    <a:blip r:embed="rId95"/>
                     <a:stretch>
                       <a:fillRect/>
                     </a:stretch>
@@ -6152,18 +6316,18 @@
           <wp:inline>
             <wp:extent cx="4190969" cy="4095720"/>
             <wp:effectExtent b="0" l="0" r="0" t="0"/>
-            <wp:docPr descr="Successful demo result with exit 0 and no settings changed" title="" id="96" name="Picture"/>
+            <wp:docPr descr="Successful demo result with exit 0 and no settings changed" title="" id="99" name="Picture"/>
             <a:graphic>
               <a:graphicData uri="http://schemas.openxmlformats.org/drawingml/2006/picture">
                 <pic:pic>
                   <pic:nvPicPr>
-                    <pic:cNvPr descr="/Users/helpdesk/Developer/GitHub/DisplayHelp/docs/images/custom-fixes-success.png" id="97" name="Picture"/>
+                    <pic:cNvPr descr="/Users/helpdesk/Developer/GitHub/DisplayHelp/docs/images/custom-fixes-success.png" id="100" name="Picture"/>
                     <pic:cNvPicPr>
                       <a:picLocks noChangeArrowheads="1" noChangeAspect="1"/>
                     </pic:cNvPicPr>
                   </pic:nvPicPr>
                   <pic:blipFill>
-                    <a:blip r:embed="rId95"/>
+                    <a:blip r:embed="rId98"/>
                     <a:stretch>
                       <a:fillRect/>
                     </a:stretch>
@@ -6228,8 +6392,8 @@
         <w:t xml:space="preserve">folder as long as the files end up owned by that user with mode 0755.</w:t>
       </w:r>
     </w:p>
-    <w:bookmarkEnd w:id="98"/>
-    <w:bookmarkStart w:id="102" w:name="more-uninstall-displayhelp"/>
+    <w:bookmarkEnd w:id="101"/>
+    <w:bookmarkStart w:id="105" w:name="more-uninstall-displayhelp"/>
     <w:p>
       <w:pPr>
         <w:pStyle w:val="Heading3"/>
@@ -6247,18 +6411,18 @@
           <wp:inline>
             <wp:extent cx="2809859" cy="2838434"/>
             <wp:effectExtent b="0" l="0" r="0" t="0"/>
-            <wp:docPr descr="DisplayHelp 0.6.6: Uninstall confirmation, canceled" title="" id="100" name="Picture"/>
+            <wp:docPr descr="DisplayHelp 0.6.6: Uninstall confirmation, canceled" title="" id="103" name="Picture"/>
             <a:graphic>
               <a:graphicData uri="http://schemas.openxmlformats.org/drawingml/2006/picture">
                 <pic:pic>
                   <pic:nvPicPr>
-                    <pic:cNvPr descr="/Users/helpdesk/Developer/GitHub/DisplayHelp/docs/images/uninstall-confirmation.png" id="101" name="Picture"/>
+                    <pic:cNvPr descr="/Users/helpdesk/Developer/GitHub/DisplayHelp/docs/images/uninstall-confirmation.png" id="104" name="Picture"/>
                     <pic:cNvPicPr>
                       <a:picLocks noChangeArrowheads="1" noChangeAspect="1"/>
                     </pic:cNvPicPr>
                   </pic:nvPicPr>
                   <pic:blipFill>
-                    <a:blip r:embed="rId99"/>
+                    <a:blip r:embed="rId102"/>
                     <a:stretch>
                       <a:fillRect/>
                     </a:stretch>
@@ -6333,7 +6497,7 @@
         <w:rPr>
           <w:rStyle w:val="VerbatimChar"/>
         </w:rPr>
-        <w:t xml:space="preserve">sudo /bin/zsh /Applications/DisplayHelp.app/Contents/Resources/DisplayHelp_DisplayHelp.bundle/Contents/Resources/Resources/Uninstall/uninstall.sh \</w:t>
+        <w:t xml:space="preserve">sudo /bin/zsh /Applications/DisplayHelp.app/Contents/Resources/DisplayHelp_DisplayHelp.bundle/Contents/Resources/uninstall.sh \</w:t>
       </w:r>
       <w:r>
         <w:br/>
@@ -6389,8 +6553,8 @@
         <w:t xml:space="preserve">.</w:t>
       </w:r>
     </w:p>
-    <w:bookmarkEnd w:id="102"/>
-    <w:bookmarkStart w:id="106" w:name="X6dff13e979610b3b32e0bff4d3dc7ecbe17779f"/>
+    <w:bookmarkEnd w:id="105"/>
+    <w:bookmarkStart w:id="109" w:name="X6dff13e979610b3b32e0bff4d3dc7ecbe17779f"/>
     <w:p>
       <w:pPr>
         <w:pStyle w:val="Heading3"/>
@@ -6408,18 +6572,18 @@
           <wp:inline>
             <wp:extent cx="4190969" cy="3428975"/>
             <wp:effectExtent b="0" l="0" r="0" t="0"/>
-            <wp:docPr descr="DisplayHelp 0.6.6 data actions with Troubleshooting, More and Recent Events expanded; sample display/history data" title="" id="104" name="Picture"/>
+            <wp:docPr descr="DisplayHelp 0.6.6 data actions with Troubleshooting, More and Recent Events expanded; sample display/history data" title="" id="107" name="Picture"/>
             <a:graphic>
               <a:graphicData uri="http://schemas.openxmlformats.org/drawingml/2006/picture">
                 <pic:pic>
                   <pic:nvPicPr>
-                    <pic:cNvPr descr="/Users/helpdesk/Developer/GitHub/DisplayHelp/docs/images/data-actions.png" id="105" name="Picture"/>
+                    <pic:cNvPr descr="/Users/helpdesk/Developer/GitHub/DisplayHelp/docs/images/data-actions.png" id="108" name="Picture"/>
                     <pic:cNvPicPr>
                       <a:picLocks noChangeArrowheads="1" noChangeAspect="1"/>
                     </pic:cNvPicPr>
                   </pic:nvPicPr>
                   <pic:blipFill>
-                    <a:blip r:embed="rId103"/>
+                    <a:blip r:embed="rId106"/>
                     <a:stretch>
                       <a:fillRect/>
                     </a:stretch>
@@ -6837,9 +7001,9 @@
         <w:t xml:space="preserve">that resets macOS display configuration.</w:t>
       </w:r>
     </w:p>
-    <w:bookmarkEnd w:id="106"/>
-    <w:bookmarkEnd w:id="107"/>
-    <w:bookmarkStart w:id="112" w:name="recent-events"/>
+    <w:bookmarkEnd w:id="109"/>
+    <w:bookmarkEnd w:id="110"/>
+    <w:bookmarkStart w:id="115" w:name="recent-events"/>
     <w:p>
       <w:pPr>
         <w:pStyle w:val="Heading2"/>
@@ -6857,18 +7021,18 @@
           <wp:inline>
             <wp:extent cx="4190969" cy="2285983"/>
             <wp:effectExtent b="0" l="0" r="0" t="0"/>
-            <wp:docPr descr="DisplayHelp 0.6.6: Sample history and Clear Connection History action" title="" id="109" name="Picture"/>
+            <wp:docPr descr="DisplayHelp 0.6.6: Sample history and Clear Connection History action" title="" id="112" name="Picture"/>
             <a:graphic>
               <a:graphicData uri="http://schemas.openxmlformats.org/drawingml/2006/picture">
                 <pic:pic>
                   <pic:nvPicPr>
-                    <pic:cNvPr descr="/Users/helpdesk/Developer/GitHub/DisplayHelp/docs/images/recent-events.png" id="110" name="Picture"/>
+                    <pic:cNvPr descr="/Users/helpdesk/Developer/GitHub/DisplayHelp/docs/images/recent-events.png" id="113" name="Picture"/>
                     <pic:cNvPicPr>
                       <a:picLocks noChangeArrowheads="1" noChangeAspect="1"/>
                     </pic:cNvPicPr>
                   </pic:nvPicPr>
                   <pic:blipFill>
-                    <a:blip r:embed="rId108"/>
+                    <a:blip r:embed="rId111"/>
                     <a:stretch>
                       <a:fillRect/>
                     </a:stretch>
@@ -6918,13 +7082,35 @@
         <w:t xml:space="preserve"> </w:t>
       </w:r>
       <w:r>
-        <w:t xml:space="preserve">copies app/macOS versions, display identities, modes, layout, HDCP state and topology with raw values (0.6.7), available-control explanations</w:t>
-      </w:r>
-      <w:r>
-        <w:t xml:space="preserve"> </w:t>
-      </w:r>
-      <w:r>
-        <w:t xml:space="preserve">and up to 20 recent events to the clipboard. Placement and rotation traces link requests, observed results, verification and Keep/Revert outcomes by a change ID. Nothing is uploaded; review the report before sharing it.</w:t>
+        <w:t xml:space="preserve">copies app/macOS versions, display identities and macOS display UUIDs, modes with the full supported-mode list, layout,</w:t>
+      </w:r>
+      <w:r>
+        <w:t xml:space="preserve"> </w:t>
+      </w:r>
+      <w:r>
+        <w:t xml:space="preserve">levels and underscan, the active audio output with volume and mute, the last HDCP reading for each external display with raw values and</w:t>
+      </w:r>
+      <w:r>
+        <w:t xml:space="preserve"> </w:t>
+      </w:r>
+      <w:r>
+        <w:t xml:space="preserve">any topology, available-control explanations and up to 20 recent events to the clipboard. The button reads</w:t>
+      </w:r>
+      <w:r>
+        <w:t xml:space="preserve"> </w:t>
+      </w:r>
+      <w:r>
+        <w:rPr>
+          <w:b/>
+          <w:bCs/>
+        </w:rPr>
+        <w:t xml:space="preserve">Diagnostics Copied</w:t>
+      </w:r>
+      <w:r>
+        <w:t xml:space="preserve"> </w:t>
+      </w:r>
+      <w:r>
+        <w:t xml:space="preserve">afterwards. Placement and rotation traces link requests, observed results, verification and Keep/Revert outcomes by a change ID. Nothing is uploaded; review the report before sharing it.</w:t>
       </w:r>
     </w:p>
     <w:p>
@@ -6954,7 +7140,20 @@
         <w:rPr>
           <w:rStyle w:val="VerbatimChar"/>
         </w:rPr>
-        <w:t xml:space="preserve">time  kind  display  (detail)</w:t>
+        <w:t xml:space="preserve">time  label  display  detail</w:t>
+      </w:r>
+      <w:r>
+        <w:t xml:space="preserve">, with the localized event name such as</w:t>
+      </w:r>
+      <w:r>
+        <w:t xml:space="preserve"> </w:t>
+      </w:r>
+      <w:r>
+        <w:rPr>
+          <w:b/>
+          <w:bCs/>
+        </w:rPr>
+        <w:t xml:space="preserve">Change Failed</w:t>
       </w:r>
       <w:r>
         <w:t xml:space="preserve">. See</w:t>
@@ -6962,7 +7161,7 @@
       <w:r>
         <w:t xml:space="preserve"> </w:t>
       </w:r>
-      <w:hyperlink r:id="rId111">
+      <w:hyperlink r:id="rId114">
         <w:r>
           <w:rPr>
             <w:rStyle w:val="Hyperlink"/>
@@ -7009,8 +7208,8 @@
         <w:t xml:space="preserve">opens the folder in Finder.</w:t>
       </w:r>
     </w:p>
-    <w:bookmarkEnd w:id="112"/>
-    <w:bookmarkStart w:id="116" w:name="start-at-login-quit-about"/>
+    <w:bookmarkEnd w:id="115"/>
+    <w:bookmarkStart w:id="119" w:name="start-at-login-quit-about"/>
     <w:p>
       <w:pPr>
         <w:pStyle w:val="Heading2"/>
@@ -7028,18 +7227,18 @@
           <wp:inline>
             <wp:extent cx="2705069" cy="2905092"/>
             <wp:effectExtent b="0" l="0" r="0" t="0"/>
-            <wp:docPr descr="DisplayHelp 0.6.6: About DisplayHelp 0.6.6 (120)" title="" id="114" name="Picture"/>
+            <wp:docPr descr="DisplayHelp 0.6.6: About DisplayHelp 0.6.6 (120)" title="" id="117" name="Picture"/>
             <a:graphic>
               <a:graphicData uri="http://schemas.openxmlformats.org/drawingml/2006/picture">
                 <pic:pic>
                   <pic:nvPicPr>
-                    <pic:cNvPr descr="/Users/helpdesk/Developer/GitHub/DisplayHelp/docs/images/about.png" id="115" name="Picture"/>
+                    <pic:cNvPr descr="/Users/helpdesk/Developer/GitHub/DisplayHelp/docs/images/about.png" id="118" name="Picture"/>
                     <pic:cNvPicPr>
                       <a:picLocks noChangeArrowheads="1" noChangeAspect="1"/>
                     </pic:cNvPicPr>
                   </pic:nvPicPr>
                   <pic:blipFill>
-                    <a:blip r:embed="rId113"/>
+                    <a:blip r:embed="rId116"/>
                     <a:stretch>
                       <a:fillRect/>
                     </a:stretch>
@@ -7154,8 +7353,8 @@
         <w:t xml:space="preserve">link opens the About panel.</w:t>
       </w:r>
     </w:p>
-    <w:bookmarkEnd w:id="116"/>
-    <w:bookmarkStart w:id="120" w:name="the-connect-dialog"/>
+    <w:bookmarkEnd w:id="119"/>
+    <w:bookmarkStart w:id="123" w:name="the-connect-dialog"/>
     <w:p>
       <w:pPr>
         <w:pStyle w:val="Heading2"/>
@@ -7173,18 +7372,18 @@
           <wp:inline>
             <wp:extent cx="2476469" cy="3028912"/>
             <wp:effectExtent b="0" l="0" r="0" t="0"/>
-            <wp:docPr descr="DisplayHelp 0.6.6: First-connection prompt using a sample display" title="" id="118" name="Picture"/>
+            <wp:docPr descr="DisplayHelp 0.6.6: First-connection prompt using a sample display" title="" id="121" name="Picture"/>
             <a:graphic>
               <a:graphicData uri="http://schemas.openxmlformats.org/drawingml/2006/picture">
                 <pic:pic>
                   <pic:nvPicPr>
-                    <pic:cNvPr descr="/Users/helpdesk/Developer/GitHub/DisplayHelp/docs/images/first-connect.png" id="119" name="Picture"/>
+                    <pic:cNvPr descr="/Users/helpdesk/Developer/GitHub/DisplayHelp/docs/images/first-connect.png" id="122" name="Picture"/>
                     <pic:cNvPicPr>
                       <a:picLocks noChangeArrowheads="1" noChangeAspect="1"/>
                     </pic:cNvPicPr>
                   </pic:nvPicPr>
                   <pic:blipFill>
-                    <a:blip r:embed="rId117"/>
+                    <a:blip r:embed="rId120"/>
                     <a:stretch>
                       <a:fillRect/>
                     </a:stretch>
@@ -7307,8 +7506,8 @@
         <w:t xml:space="preserve">mirroring, Best for Display when extending.</w:t>
       </w:r>
     </w:p>
-    <w:bookmarkEnd w:id="120"/>
-    <w:bookmarkStart w:id="121" w:name="Xc6bbff7ca76b967f9df64a308f1bdb464fe71e0"/>
+    <w:bookmarkEnd w:id="123"/>
+    <w:bookmarkStart w:id="124" w:name="Xc6bbff7ca76b967f9df64a308f1bdb464fe71e0"/>
     <w:p>
       <w:pPr>
         <w:pStyle w:val="Heading2"/>
@@ -7668,8 +7867,8 @@
         <w:t xml:space="preserve">modes; explicitly loading a profile attempts the exact saved mode and verifies the result.</w:t>
       </w:r>
     </w:p>
-    <w:bookmarkEnd w:id="121"/>
-    <w:bookmarkStart w:id="122" w:name="keyboard-and-accessibility"/>
+    <w:bookmarkEnd w:id="124"/>
+    <w:bookmarkStart w:id="125" w:name="keyboard-and-accessibility"/>
     <w:p>
       <w:pPr>
         <w:pStyle w:val="Heading2"/>
@@ -7761,7 +7960,7 @@
         </w:numPr>
       </w:pPr>
       <w:r>
-        <w:t xml:space="preserve">Colour never carries meaning alone: the green/orange dot has a spoken label and a tooltip.</w:t>
+        <w:t xml:space="preserve">Colour never carries meaning alone: the green check / grey ⓘ status icon has a spoken label and a tooltip.</w:t>
       </w:r>
     </w:p>
     <w:p>
@@ -7776,8 +7975,8 @@
         <w:t xml:space="preserve">The menu respects the system’s text size, light and dark appearance, and increased contrast.</w:t>
       </w:r>
     </w:p>
-    <w:bookmarkEnd w:id="122"/>
-    <w:bookmarkStart w:id="132" w:name="language"/>
+    <w:bookmarkEnd w:id="125"/>
+    <w:bookmarkStart w:id="135" w:name="language"/>
     <w:p>
       <w:pPr>
         <w:pStyle w:val="Heading2"/>
@@ -8109,7 +8308,7 @@
         </w:tc>
       </w:tr>
     </w:tbl>
-    <w:bookmarkStart w:id="123" w:name="follow-your-macs-language"/>
+    <w:bookmarkStart w:id="126" w:name="follow-your-macs-language"/>
     <w:p>
       <w:pPr>
         <w:pStyle w:val="Heading3"/>
@@ -8176,8 +8375,8 @@
         <w:t xml:space="preserve">For example, a Mac set to Italian uses Italian when DisplayHelp follows the system. An unsupported first language can fall back to another supported language in your preferred list.</w:t>
       </w:r>
     </w:p>
-    <w:bookmarkEnd w:id="123"/>
-    <w:bookmarkStart w:id="124" w:name="choose-a-language-inside-displayhelp"/>
+    <w:bookmarkEnd w:id="126"/>
+    <w:bookmarkStart w:id="127" w:name="choose-a-language-inside-displayhelp"/>
     <w:p>
       <w:pPr>
         <w:pStyle w:val="Heading3"/>
@@ -8303,8 +8502,8 @@
         <w:t xml:space="preserve">to return to the Mac’s preferences. The globe is temporarily unavailable while display changes, profile checks or fixes are running.</w:t>
       </w:r>
     </w:p>
-    <w:bookmarkEnd w:id="124"/>
-    <w:bookmarkStart w:id="131" w:name="macos-settings-versus-the-in-app-globe"/>
+    <w:bookmarkEnd w:id="127"/>
+    <w:bookmarkStart w:id="134" w:name="macos-settings-versus-the-in-app-globe"/>
     <w:p>
       <w:pPr>
         <w:pStyle w:val="Heading3"/>
@@ -8499,18 +8698,18 @@
           <wp:inline>
             <wp:extent cx="1428750" cy="3171825"/>
             <wp:effectExtent b="0" l="0" r="0" t="0"/>
-            <wp:docPr descr="DisplayHelp globe menu showing Follow System and all eleven language choices" title="" id="126" name="Picture"/>
+            <wp:docPr descr="DisplayHelp globe menu showing Follow System and all eleven language choices" title="" id="129" name="Picture"/>
             <a:graphic>
               <a:graphicData uri="http://schemas.openxmlformats.org/drawingml/2006/picture">
                 <pic:pic>
                   <pic:nvPicPr>
-                    <pic:cNvPr descr="/Users/helpdesk/Developer/GitHub/DisplayHelp/docs/images/language-menu.png" id="127" name="Picture"/>
+                    <pic:cNvPr descr="/Users/helpdesk/Developer/GitHub/DisplayHelp/docs/images/language-menu.png" id="130" name="Picture"/>
                     <pic:cNvPicPr>
                       <a:picLocks noChangeArrowheads="1" noChangeAspect="1"/>
                     </pic:cNvPicPr>
                   </pic:nvPicPr>
                   <pic:blipFill>
-                    <a:blip r:embed="rId125"/>
+                    <a:blip r:embed="rId128"/>
                     <a:stretch>
                       <a:fillRect/>
                     </a:stretch>
@@ -8554,18 +8753,18 @@
           <wp:inline>
             <wp:extent cx="2476469" cy="2228822"/>
             <wp:effectExtent b="0" l="0" r="0" t="0"/>
-            <wp:docPr descr="Restart DisplayHelp to apply the app-only language selection, or choose Later" title="" id="129" name="Picture"/>
+            <wp:docPr descr="Restart DisplayHelp to apply the app-only language selection, or choose Later" title="" id="132" name="Picture"/>
             <a:graphic>
               <a:graphicData uri="http://schemas.openxmlformats.org/drawingml/2006/picture">
                 <pic:pic>
                   <pic:nvPicPr>
-                    <pic:cNvPr descr="/Users/helpdesk/Developer/GitHub/DisplayHelp/docs/images/language-confirmation.png" id="130" name="Picture"/>
+                    <pic:cNvPr descr="/Users/helpdesk/Developer/GitHub/DisplayHelp/docs/images/language-confirmation.png" id="133" name="Picture"/>
                     <pic:cNvPicPr>
                       <a:picLocks noChangeArrowheads="1" noChangeAspect="1"/>
                     </pic:cNvPicPr>
                   </pic:nvPicPr>
                   <pic:blipFill>
-                    <a:blip r:embed="rId128"/>
+                    <a:blip r:embed="rId131"/>
                     <a:stretch>
                       <a:fillRect/>
                     </a:stretch>
@@ -8625,10 +8824,10 @@
         <w:t xml:space="preserve">for Traditional Chinese and Arabic. Translation terminology has been checked against Apple documentation; independent native-speaker review remains pending.</w:t>
       </w:r>
     </w:p>
-    <w:bookmarkEnd w:id="131"/>
-    <w:bookmarkEnd w:id="132"/>
-    <w:bookmarkEnd w:id="133"/>
-    <w:bookmarkStart w:id="139" w:name="faq"/>
+    <w:bookmarkEnd w:id="134"/>
+    <w:bookmarkEnd w:id="135"/>
+    <w:bookmarkEnd w:id="136"/>
+    <w:bookmarkStart w:id="142" w:name="faq"/>
     <w:p>
       <w:pPr>
         <w:pStyle w:val="Heading1"/>
@@ -8878,7 +9077,7 @@
           <w:b/>
           <w:bCs/>
         </w:rPr>
-        <w:t xml:space="preserve">Favorite 1</w:t>
+        <w:t xml:space="preserve">Favorite 1 (⌘⌥1)</w:t>
       </w:r>
       <w:r>
         <w:t xml:space="preserve"> </w:t>
@@ -8894,13 +9093,13 @@
           <w:b/>
           <w:bCs/>
         </w:rPr>
-        <w:t xml:space="preserve">Favorite 2</w:t>
-      </w:r>
-      <w:r>
-        <w:t xml:space="preserve"> </w:t>
-      </w:r>
-      <w:r>
-        <w:t xml:space="preserve">rows (0.6.6). Each monitor can have its own resolution in Extend mode. Layout-only profiles include rotation,</w:t>
+        <w:t xml:space="preserve">Favorite 2 (⌘⌥2)</w:t>
+      </w:r>
+      <w:r>
+        <w:t xml:space="preserve"> </w:t>
+      </w:r>
+      <w:r>
+        <w:t xml:space="preserve">rows (since 0.6.6). Each monitor can have its own resolution in Extend mode. Layout-only profiles include rotation,</w:t>
       </w:r>
       <w:r>
         <w:t xml:space="preserve"> </w:t>
@@ -8924,7 +9123,7 @@
         <w:t xml:space="preserve"> </w:t>
       </w:r>
       <w:r>
-        <w:t xml:space="preserve">In 0.6.6, yes: press and release</w:t>
+        <w:t xml:space="preserve">Since 0.6.6, yes: press and release</w:t>
       </w:r>
       <w:r>
         <w:t xml:space="preserve"> </w:t>
@@ -8986,7 +9185,7 @@
         <w:t xml:space="preserve"> </w:t>
       </w:r>
       <w:r>
-        <w:t xml:space="preserve">In 0.6.6, yes, if macOS supplies distinct display UUIDs. These profiles require manual preview and cannot</w:t>
+        <w:t xml:space="preserve">Since 0.6.6, yes, if macOS supplies distinct display UUIDs. These profiles require manual preview and cannot</w:t>
       </w:r>
       <w:r>
         <w:t xml:space="preserve"> </w:t>
@@ -9009,7 +9208,7 @@
       <w:r>
         <w:t xml:space="preserve"> </w:t>
       </w:r>
-      <w:hyperlink r:id="rId134">
+      <w:hyperlink r:id="rId137">
         <w:r>
           <w:rPr>
             <w:rStyle w:val="Hyperlink"/>
@@ -9146,7 +9345,7 @@
       <w:r>
         <w:t xml:space="preserve"> </w:t>
       </w:r>
-      <w:hyperlink r:id="rId135">
+      <w:hyperlink r:id="rId138">
         <w:r>
           <w:rPr>
             <w:rStyle w:val="Hyperlink"/>
@@ -9468,31 +9667,49 @@
           <w:b/>
           <w:bCs/>
         </w:rPr>
-        <w:t xml:space="preserve">Why can one display be orange while the laptop is green?</w:t>
-      </w:r>
-      <w:r>
-        <w:t xml:space="preserve"> </w:t>
-      </w:r>
-      <w:r>
-        <w:t xml:space="preserve">An orange dot means a different mode is recommended or an external primary display is below the preferred</w:t>
-      </w:r>
-      <w:r>
-        <w:t xml:space="preserve"> </w:t>
-      </w:r>
-      <w:r>
-        <w:t xml:space="preserve">50 Hz minimum. Each card is checked separately; mirrored displays can report different refresh rates.</w:t>
-      </w:r>
-      <w:r>
-        <w:t xml:space="preserve"> </w:t>
-      </w:r>
-      <w:r>
-        <w:t xml:space="preserve">The current screenshots use sample modes to illustrate the controls. Try an available recommendation or inspect</w:t>
-      </w:r>
-      <w:r>
-        <w:t xml:space="preserve"> </w:t>
-      </w:r>
-      <w:r>
-        <w:t xml:space="preserve">the offered refresh rates. An orange dot is not proof that a faster mode is supported.</w:t>
+        <w:t xml:space="preserve">Why does one display show a grey ⓘ while the laptop shows a green check?</w:t>
+      </w:r>
+      <w:r>
+        <w:t xml:space="preserve"> </w:t>
+      </w:r>
+      <w:r>
+        <w:t xml:space="preserve">The grey ⓘ means a different mode is recommended, or an external display that is not a mirror follower is below the</w:t>
+      </w:r>
+      <w:r>
+        <w:t xml:space="preserve"> </w:t>
+      </w:r>
+      <w:r>
+        <w:t xml:space="preserve">preferred 50 Hz minimum. Each card is checked separately; mirrored displays can report different refresh rates.</w:t>
+      </w:r>
+      <w:r>
+        <w:t xml:space="preserve"> </w:t>
+      </w:r>
+      <w:r>
+        <w:t xml:space="preserve">When a faster rate exists at the same size, an orange</w:t>
+      </w:r>
+      <w:r>
+        <w:t xml:space="preserve"> </w:t>
+      </w:r>
+      <w:r>
+        <w:t xml:space="preserve">“60 Hz is available…”</w:t>
+      </w:r>
+      <w:r>
+        <w:t xml:space="preserve"> </w:t>
+      </w:r>
+      <w:r>
+        <w:t xml:space="preserve">link appears under the status line;</w:t>
+      </w:r>
+      <w:r>
+        <w:t xml:space="preserve"> </w:t>
+      </w:r>
+      <w:r>
+        <w:t xml:space="preserve">otherwise try an available recommendation or inspect the offered refresh rates. The grey ⓘ is not proof that a</w:t>
+      </w:r>
+      <w:r>
+        <w:t xml:space="preserve"> </w:t>
+      </w:r>
+      <w:r>
+        <w:t xml:space="preserve">faster mode is supported.</w:t>
       </w:r>
     </w:p>
     <w:p>
@@ -9668,7 +9885,7 @@
       <w:r>
         <w:t xml:space="preserve"> </w:t>
       </w:r>
-      <w:hyperlink r:id="rId136">
+      <w:hyperlink r:id="rId139">
         <w:r>
           <w:rPr>
             <w:rStyle w:val="Hyperlink"/>
@@ -9970,7 +10187,7 @@
         <w:t xml:space="preserve">Place acts on the card you opened. Choosing “Built-in Display left of SAMSUNG” puts the laptop on the left and SAMSUNG on the right. To put SAMSUNG left of the laptop, open Place… on SAMSUNG’s card and choose it left of Built-in Display. The visible placement, alignment and rotation describe the actual setup.</w:t>
       </w:r>
     </w:p>
-    <w:bookmarkStart w:id="138" w:name="X659270d6f81ca5d909cf0b22b18d20410103a55"/>
+    <w:bookmarkStart w:id="141" w:name="X659270d6f81ca5d909cf0b22b18d20410103a55"/>
     <w:p>
       <w:pPr>
         <w:pStyle w:val="Heading2"/>
@@ -10013,7 +10230,7 @@
       <w:r>
         <w:t xml:space="preserve"> </w:t>
       </w:r>
-      <w:hyperlink r:id="rId137">
+      <w:hyperlink r:id="rId140">
         <w:r>
           <w:rPr>
             <w:rStyle w:val="Hyperlink"/>
@@ -10025,9 +10242,9 @@
         <w:t xml:space="preserve">.</w:t>
       </w:r>
     </w:p>
-    <w:bookmarkEnd w:id="138"/>
-    <w:bookmarkEnd w:id="139"/>
-    <w:bookmarkStart w:id="188" w:name="troubleshooting"/>
+    <w:bookmarkEnd w:id="141"/>
+    <w:bookmarkEnd w:id="142"/>
+    <w:bookmarkStart w:id="191" w:name="troubleshooting"/>
     <w:p>
       <w:pPr>
         <w:pStyle w:val="Heading1"/>
@@ -10052,7 +10269,7 @@
       <w:r>
         <w:t xml:space="preserve"> </w:t>
       </w:r>
-      <w:hyperlink r:id="rId140">
+      <w:hyperlink r:id="rId143">
         <w:r>
           <w:rPr>
             <w:rStyle w:val="Hyperlink"/>
@@ -10073,7 +10290,7 @@
         <w:t xml:space="preserve">modes vary by Mac, cable and port.</w:t>
       </w:r>
     </w:p>
-    <w:bookmarkStart w:id="141" w:name="contents-1"/>
+    <w:bookmarkStart w:id="144" w:name="contents-1"/>
     <w:p>
       <w:pPr>
         <w:pStyle w:val="Heading2"/>
@@ -10191,8 +10408,8 @@
         </w:pict>
       </w:r>
     </w:p>
-    <w:bookmarkEnd w:id="141"/>
-    <w:bookmarkStart w:id="148" w:name="picture-and-layout"/>
+    <w:bookmarkEnd w:id="144"/>
+    <w:bookmarkStart w:id="151" w:name="picture-and-layout"/>
     <w:p>
       <w:pPr>
         <w:pStyle w:val="Heading2"/>
@@ -10201,7 +10418,7 @@
         <w:t xml:space="preserve">Picture and layout</w:t>
       </w:r>
     </w:p>
-    <w:bookmarkStart w:id="142" w:name="X82e123150de438f1c200291ce92a1676b84fa91"/>
+    <w:bookmarkStart w:id="145" w:name="X82e123150de438f1c200291ce92a1676b84fa91"/>
     <w:p>
       <w:pPr>
         <w:pStyle w:val="Heading3"/>
@@ -10225,7 +10442,7 @@
         <w:t xml:space="preserve"> </w:t>
       </w:r>
       <w:r>
-        <w:t xml:space="preserve">Wait two seconds. If still wrong, open</w:t>
+        <w:t xml:space="preserve">Wait about three seconds. If still wrong, open</w:t>
       </w:r>
       <w:r>
         <w:t xml:space="preserve"> </w:t>
@@ -10263,8 +10480,8 @@
         <w:t xml:space="preserve">restarts the Dock after any display change that ends mirrored, once the burst of changes settles.</w:t>
       </w:r>
     </w:p>
-    <w:bookmarkEnd w:id="142"/>
-    <w:bookmarkStart w:id="143" w:name="Xfb0234130da404ecddbe50f67bb27c1554369e4"/>
+    <w:bookmarkEnd w:id="145"/>
+    <w:bookmarkStart w:id="146" w:name="Xfb0234130da404ecddbe50f67bb27c1554369e4"/>
     <w:p>
       <w:pPr>
         <w:pStyle w:val="Heading3"/>
@@ -10365,8 +10582,8 @@
         <w:t xml:space="preserve">wait for the confirmation deadline to revert instead of keeping it.</w:t>
       </w:r>
     </w:p>
-    <w:bookmarkEnd w:id="143"/>
-    <w:bookmarkStart w:id="144" w:name="everything-on-the-tv-is-tiny"/>
+    <w:bookmarkEnd w:id="146"/>
+    <w:bookmarkStart w:id="147" w:name="everything-on-the-tv-is-tiny"/>
     <w:p>
       <w:pPr>
         <w:pStyle w:val="Heading3"/>
@@ -10428,8 +10645,8 @@
         <w:t xml:space="preserve">1920×1080 HiDPI, which is sharp and readable.</w:t>
       </w:r>
     </w:p>
-    <w:bookmarkEnd w:id="144"/>
-    <w:bookmarkStart w:id="145" w:name="X5f2d60a8f5ce5bb701abc8287569eab4a33a7a1"/>
+    <w:bookmarkEnd w:id="147"/>
+    <w:bookmarkStart w:id="148" w:name="X5f2d60a8f5ce5bb701abc8287569eab4a33a7a1"/>
     <w:p>
       <w:pPr>
         <w:pStyle w:val="Heading3"/>
@@ -10510,8 +10727,8 @@
         <w:t xml:space="preserve">identical.</w:t>
       </w:r>
     </w:p>
-    <w:bookmarkEnd w:id="145"/>
-    <w:bookmarkStart w:id="146" w:name="the-laptop-and-tv-are-on-different-sizes"/>
+    <w:bookmarkEnd w:id="148"/>
+    <w:bookmarkStart w:id="149" w:name="the-laptop-and-tv-are-on-different-sizes"/>
     <w:p>
       <w:pPr>
         <w:pStyle w:val="Heading3"/>
@@ -10573,8 +10790,8 @@
         <w:t xml:space="preserve">was not running. The app re-mirrors the set, which makes macOS put the laptop back on the TV’s size.</w:t>
       </w:r>
     </w:p>
-    <w:bookmarkEnd w:id="146"/>
-    <w:bookmarkStart w:id="147" w:name="X6dfc21217b62a1ebab5e2e08781264a2700369e"/>
+    <w:bookmarkEnd w:id="149"/>
+    <w:bookmarkStart w:id="150" w:name="X6dfc21217b62a1ebab5e2e08781264a2700369e"/>
     <w:p>
       <w:pPr>
         <w:pStyle w:val="Heading3"/>
@@ -10633,9 +10850,9 @@
         <w:t xml:space="preserve">.</w:t>
       </w:r>
     </w:p>
-    <w:bookmarkEnd w:id="147"/>
-    <w:bookmarkEnd w:id="148"/>
-    <w:bookmarkStart w:id="153" w:name="connection"/>
+    <w:bookmarkEnd w:id="150"/>
+    <w:bookmarkEnd w:id="151"/>
+    <w:bookmarkStart w:id="156" w:name="connection"/>
     <w:p>
       <w:pPr>
         <w:pStyle w:val="Heading2"/>
@@ -10644,7 +10861,7 @@
         <w:t xml:space="preserve">Connection</w:t>
       </w:r>
     </w:p>
-    <w:bookmarkStart w:id="149" w:name="Xbf17b323036102cb0637ec4097597e7144c58a4"/>
+    <w:bookmarkStart w:id="152" w:name="Xbf17b323036102cb0637ec4097597e7144c58a4"/>
     <w:p>
       <w:pPr>
         <w:pStyle w:val="Heading3"/>
@@ -10775,8 +10992,8 @@
         <w:t xml:space="preserve">reconnect; it never disconnects anything.</w:t>
       </w:r>
     </w:p>
-    <w:bookmarkEnd w:id="149"/>
-    <w:bookmarkStart w:id="150" w:name="Xd7137ed43a1016018c8568ef1ae65dba0c487dc"/>
+    <w:bookmarkEnd w:id="152"/>
+    <w:bookmarkStart w:id="153" w:name="Xd7137ed43a1016018c8568ef1ae65dba0c487dc"/>
     <w:p>
       <w:pPr>
         <w:pStyle w:val="Heading3"/>
@@ -10809,8 +11026,8 @@
         <w:t xml:space="preserve">saved data was removed by the uninstaller with purge on. Answer once and it is remembered again.</w:t>
       </w:r>
     </w:p>
-    <w:bookmarkEnd w:id="150"/>
-    <w:bookmarkStart w:id="151" w:name="X06ef9e1fb6197e69548f8b3ba27193891f41d25"/>
+    <w:bookmarkEnd w:id="153"/>
+    <w:bookmarkStart w:id="154" w:name="X06ef9e1fb6197e69548f8b3ba27193891f41d25"/>
     <w:p>
       <w:pPr>
         <w:pStyle w:val="Heading3"/>
@@ -10861,8 +11078,8 @@
         <w:t xml:space="preserve">display’s name.</w:t>
       </w:r>
     </w:p>
-    <w:bookmarkEnd w:id="151"/>
-    <w:bookmarkStart w:id="152" w:name="only-the-built-in-display-is-found"/>
+    <w:bookmarkEnd w:id="154"/>
+    <w:bookmarkStart w:id="155" w:name="only-the-built-in-display-is-found"/>
     <w:p>
       <w:pPr>
         <w:pStyle w:val="Heading3"/>
@@ -10886,7 +11103,20 @@
         <w:t xml:space="preserve"> </w:t>
       </w:r>
       <w:r>
-        <w:t xml:space="preserve">The message under the cards says it: check the cable and the projector’s input. On a USB-C dock, try the</w:t>
+        <w:t xml:space="preserve">Press</w:t>
+      </w:r>
+      <w:r>
+        <w:t xml:space="preserve"> </w:t>
+      </w:r>
+      <w:r>
+        <w:rPr>
+          <w:b/>
+          <w:bCs/>
+        </w:rPr>
+        <w:t xml:space="preserve">Detect Displays</w:t>
+      </w:r>
+      <w:r>
+        <w:t xml:space="preserve">; the message under the cards says it: check the cable and the projector’s input. On a USB-C dock, try the</w:t>
       </w:r>
       <w:r>
         <w:t xml:space="preserve"> </w:t>
@@ -10895,9 +11125,9 @@
         <w:t xml:space="preserve">Mac’s own port.</w:t>
       </w:r>
     </w:p>
-    <w:bookmarkEnd w:id="152"/>
-    <w:bookmarkEnd w:id="153"/>
-    <w:bookmarkStart w:id="170" w:name="controls-and-buttons"/>
+    <w:bookmarkEnd w:id="155"/>
+    <w:bookmarkEnd w:id="156"/>
+    <w:bookmarkStart w:id="173" w:name="controls-and-buttons"/>
     <w:p>
       <w:pPr>
         <w:pStyle w:val="Heading2"/>
@@ -10906,7 +11136,7 @@
         <w:t xml:space="preserve">Controls and buttons</w:t>
       </w:r>
     </w:p>
-    <w:bookmarkStart w:id="154" w:name="X189378a9b5c4c2dd79bd2dcb3196528111c6a3b"/>
+    <w:bookmarkStart w:id="157" w:name="X189378a9b5c4c2dd79bd2dcb3196528111c6a3b"/>
     <w:p>
       <w:pPr>
         <w:pStyle w:val="Heading3"/>
@@ -10936,17 +11166,17 @@
         <w:t xml:space="preserve"> </w:t>
       </w:r>
       <w:r>
-        <w:t xml:space="preserve">The dot can still be orange when the current refresh rate is below 50 Hz.</w:t>
-      </w:r>
-    </w:p>
-    <w:bookmarkEnd w:id="154"/>
-    <w:bookmarkStart w:id="155" w:name="Xbaecde92a5ef4b95c69828db2e5992310a02d42"/>
+        <w:t xml:space="preserve">The status icon can still be the grey ⓘ when the current refresh rate is below 50 Hz.</w:t>
+      </w:r>
+    </w:p>
+    <w:bookmarkEnd w:id="157"/>
+    <w:bookmarkStart w:id="158" w:name="X34be2b1480a8d411d8a0e7512016d5fcd4943ca"/>
     <w:p>
       <w:pPr>
         <w:pStyle w:val="Heading3"/>
       </w:pPr>
       <w:r>
-        <w:t xml:space="preserve">The TV is orange at 30 Hz but the built-in card is green at 60 Hz</w:t>
+        <w:t xml:space="preserve">The TV shows a grey ⓘ at 30 Hz but the built-in card is green at 60 Hz</w:t>
       </w:r>
     </w:p>
     <w:p>
@@ -11034,7 +11264,7 @@
         <w:t xml:space="preserve"> </w:t>
       </w:r>
       <w:r>
-        <w:t xml:space="preserve">The status dot flags external-primary rates below 50 Hz. Mirrored displays share a logical size,</w:t>
+        <w:t xml:space="preserve">The status icon flags any external display that is not a mirror follower when it runs below 50 Hz; when a faster rate exists at the same size, an orange one-click hint appears under the status line. Mirrored displays share a logical size,</w:t>
       </w:r>
       <w:r>
         <w:t xml:space="preserve"> </w:t>
@@ -11049,8 +11279,8 @@
         <w:t xml:space="preserve">Recommendations prefer 50 Hz or better, but fall back when none is available.</w:t>
       </w:r>
     </w:p>
-    <w:bookmarkEnd w:id="155"/>
-    <w:bookmarkStart w:id="156" w:name="X44969330943e9cfead843a705f2ee9898e19689"/>
+    <w:bookmarkEnd w:id="158"/>
+    <w:bookmarkStart w:id="159" w:name="X44969330943e9cfead843a705f2ee9898e19689"/>
     <w:p>
       <w:pPr>
         <w:pStyle w:val="Heading3"/>
@@ -11117,14 +11347,14 @@
         <w:t xml:space="preserve">also requires an exact, unambiguous set and must be enabled explicitly.</w:t>
       </w:r>
     </w:p>
-    <w:bookmarkEnd w:id="156"/>
-    <w:bookmarkStart w:id="157" w:name="Xd7b166d82c8052a3f21704230323e217b2a2029"/>
+    <w:bookmarkEnd w:id="159"/>
+    <w:bookmarkStart w:id="160" w:name="Xed348068975c5041e0b91f43ed9499efff73969"/>
     <w:p>
       <w:pPr>
         <w:pStyle w:val="Heading3"/>
       </w:pPr>
       <w:r>
-        <w:t xml:space="preserve">Identical monitors cannot save or automatically load a profile (0.6.6)</w:t>
+        <w:t xml:space="preserve">Identical monitors cannot save or automatically load a profile (since 0.6.6)</w:t>
       </w:r>
     </w:p>
     <w:p>
@@ -11203,14 +11433,14 @@
         <w:t xml:space="preserve">yet; renaming monitors or resetting app data will not resolve the ambiguity.</w:t>
       </w:r>
     </w:p>
-    <w:bookmarkEnd w:id="157"/>
-    <w:bookmarkStart w:id="158" w:name="X6bcb551aca39bde5a0ddb5e206b6d24ab9716a2"/>
+    <w:bookmarkEnd w:id="160"/>
+    <w:bookmarkStart w:id="161" w:name="X878a2dd9260edfb41d38e8e1459534d630bb9b6"/>
     <w:p>
       <w:pPr>
         <w:pStyle w:val="Heading3"/>
       </w:pPr>
       <w:r>
-        <w:t xml:space="preserve">A profile targets the wrong identical monitor after cables or ports were swapped (0.6.6)</w:t>
+        <w:t xml:space="preserve">A profile targets the wrong identical monitor after cables or ports were swapped (since 0.6.6)</w:t>
       </w:r>
     </w:p>
     <w:p>
@@ -11304,7 +11534,7 @@
       <w:r>
         <w:t xml:space="preserve"> </w:t>
       </w:r>
-      <w:hyperlink r:id="rId134">
+      <w:hyperlink r:id="rId137">
         <w:r>
           <w:rPr>
             <w:rStyle w:val="Hyperlink"/>
@@ -11316,8 +11546,8 @@
         <w:t xml:space="preserve">.</w:t>
       </w:r>
     </w:p>
-    <w:bookmarkEnd w:id="158"/>
-    <w:bookmarkStart w:id="159" w:name="X6213711d1bf40f750ef4ad4626da1a1dc5b9f77"/>
+    <w:bookmarkEnd w:id="161"/>
+    <w:bookmarkStart w:id="162" w:name="X6213711d1bf40f750ef4ad4626da1a1dc5b9f77"/>
     <w:p>
       <w:pPr>
         <w:pStyle w:val="Heading3"/>
@@ -11356,8 +11586,8 @@
         <w:t xml:space="preserve">Closing the menu does not dismiss the floating confirmation window.</w:t>
       </w:r>
     </w:p>
-    <w:bookmarkEnd w:id="159"/>
-    <w:bookmarkStart w:id="160" w:name="revert-could-not-restore-every-setting"/>
+    <w:bookmarkEnd w:id="162"/>
+    <w:bookmarkStart w:id="163" w:name="revert-could-not-restore-every-setting"/>
     <w:p>
       <w:pPr>
         <w:pStyle w:val="Heading3"/>
@@ -11428,8 +11658,8 @@
         <w:t xml:space="preserve">previous reconnect preferences and reports incomplete recovery rather than treating it as success.</w:t>
       </w:r>
     </w:p>
-    <w:bookmarkEnd w:id="160"/>
-    <w:bookmarkStart w:id="161" w:name="favorite-shortcuts-do-nothing"/>
+    <w:bookmarkEnd w:id="163"/>
+    <w:bookmarkStart w:id="164" w:name="favorite-shortcuts-do-nothing"/>
     <w:p>
       <w:pPr>
         <w:pStyle w:val="Heading3"/>
@@ -11453,30 +11683,30 @@
         <w:t xml:space="preserve"> </w:t>
       </w:r>
       <w:r>
-        <w:t xml:space="preserve">Assign slots under</w:t>
-      </w:r>
-      <w:r>
-        <w:t xml:space="preserve"> </w:t>
-      </w:r>
-      <w:r>
-        <w:rPr>
-          <w:b/>
-          <w:bCs/>
-        </w:rPr>
-        <w:t xml:space="preserve">Profile › Favorite Shortcuts</w:t>
-      </w:r>
-      <w:r>
-        <w:t xml:space="preserve">, activate DisplayHelp and press</w:t>
-      </w:r>
-      <w:r>
-        <w:t xml:space="preserve"> </w:t>
-      </w:r>
-      <w:r>
-        <w:rPr>
-          <w:b/>
-          <w:bCs/>
-        </w:rPr>
-        <w:t xml:space="preserve">⌘⌥1</w:t>
+        <w:t xml:space="preserve">Expand</w:t>
+      </w:r>
+      <w:r>
+        <w:t xml:space="preserve"> </w:t>
+      </w:r>
+      <w:r>
+        <w:rPr>
+          <w:b/>
+          <w:bCs/>
+        </w:rPr>
+        <w:t xml:space="preserve">Quick Switch Profiles</w:t>
+      </w:r>
+      <w:r>
+        <w:t xml:space="preserve">, choose a profile beside</w:t>
+      </w:r>
+      <w:r>
+        <w:t xml:space="preserve"> </w:t>
+      </w:r>
+      <w:r>
+        <w:rPr>
+          <w:b/>
+          <w:bCs/>
+        </w:rPr>
+        <w:t xml:space="preserve">Favorite 1 (⌘⌥1)</w:t>
       </w:r>
       <w:r>
         <w:t xml:space="preserve"> </w:t>
@@ -11492,10 +11722,50 @@
           <w:b/>
           <w:bCs/>
         </w:rPr>
-        <w:t xml:space="preserve">⌘⌥2</w:t>
-      </w:r>
-      <w:r>
-        <w:t xml:space="preserve">.</w:t>
+        <w:t xml:space="preserve">Favorite 2 (⌘⌥2)</w:t>
+      </w:r>
+      <w:r>
+        <w:t xml:space="preserve">, then</w:t>
+      </w:r>
+      <w:r>
+        <w:t xml:space="preserve"> </w:t>
+      </w:r>
+      <w:r>
+        <w:t xml:space="preserve">press the shortcut from any app while DisplayHelp is running. If the note</w:t>
+      </w:r>
+      <w:r>
+        <w:t xml:space="preserve"> </w:t>
+      </w:r>
+      <w:r>
+        <w:t xml:space="preserve">“System-wide shortcut unavailable”</w:t>
+      </w:r>
+      <w:r>
+        <w:t xml:space="preserve"> </w:t>
+      </w:r>
+      <w:r>
+        <w:t xml:space="preserve">appears</w:t>
+      </w:r>
+      <w:r>
+        <w:t xml:space="preserve"> </w:t>
+      </w:r>
+      <w:r>
+        <w:t xml:space="preserve">under a slot, use</w:t>
+      </w:r>
+      <w:r>
+        <w:t xml:space="preserve"> </w:t>
+      </w:r>
+      <w:r>
+        <w:rPr>
+          <w:b/>
+          <w:bCs/>
+        </w:rPr>
+        <w:t xml:space="preserve">Preview</w:t>
+      </w:r>
+      <w:r>
+        <w:t xml:space="preserve"> </w:t>
+      </w:r>
+      <w:r>
+        <w:t xml:space="preserve">or the in-app shortcut instead.</w:t>
       </w:r>
       <w:r>
         <w:t xml:space="preserve"> </w:t>
@@ -11511,17 +11781,23 @@
         <w:t xml:space="preserve"> </w:t>
       </w:r>
       <w:r>
-        <w:t xml:space="preserve">These are local shortcuts, not system-wide hotkeys. They are unavailable during a display operation or</w:t>
-      </w:r>
-      <w:r>
-        <w:t xml:space="preserve"> </w:t>
-      </w:r>
-      <w:r>
-        <w:t xml:space="preserve">pending confirmation and open a preview before applying anything.</w:t>
-      </w:r>
-    </w:p>
-    <w:bookmarkEnd w:id="161"/>
-    <w:bookmarkStart w:id="162" w:name="the-profile-library-cannot-be-loaded"/>
+        <w:t xml:space="preserve">The shortcuts are system-wide hotkeys registered while a favorite is assigned; another app may already own</w:t>
+      </w:r>
+      <w:r>
+        <w:t xml:space="preserve"> </w:t>
+      </w:r>
+      <w:r>
+        <w:t xml:space="preserve">the combination. They are unavailable during a display operation or pending confirmation and open a preview before</w:t>
+      </w:r>
+      <w:r>
+        <w:t xml:space="preserve"> </w:t>
+      </w:r>
+      <w:r>
+        <w:t xml:space="preserve">applying anything.</w:t>
+      </w:r>
+    </w:p>
+    <w:bookmarkEnd w:id="164"/>
+    <w:bookmarkStart w:id="165" w:name="the-profile-library-cannot-be-loaded"/>
     <w:p>
       <w:pPr>
         <w:pStyle w:val="Heading3"/>
@@ -11628,8 +11904,8 @@
         <w:t xml:space="preserve">until recovery so the unreadable original cannot silently be overwritten.</w:t>
       </w:r>
     </w:p>
-    <w:bookmarkEnd w:id="162"/>
-    <w:bookmarkStart w:id="163" w:name="reconnect-preferences-could-not-be-saved"/>
+    <w:bookmarkEnd w:id="165"/>
+    <w:bookmarkStart w:id="166" w:name="reconnect-preferences-could-not-be-saved"/>
     <w:p>
       <w:pPr>
         <w:pStyle w:val="Heading3"/>
@@ -11699,8 +11975,8 @@
         <w:t xml:space="preserve">error does not prove the hardware change failed, but that change may not be recalled on reconnect.</w:t>
       </w:r>
     </w:p>
-    <w:bookmarkEnd w:id="163"/>
-    <w:bookmarkStart w:id="164" w:name="Xe0ceaf7c29d5e5d05459c0fea4bc9595c94c02e"/>
+    <w:bookmarkEnd w:id="166"/>
+    <w:bookmarkStart w:id="167" w:name="Xe0ceaf7c29d5e5d05459c0fea4bc9595c94c02e"/>
     <w:p>
       <w:pPr>
         <w:pStyle w:val="Heading3"/>
@@ -11773,8 +12049,8 @@
         <w:t xml:space="preserve">controls can still work.</w:t>
       </w:r>
     </w:p>
-    <w:bookmarkEnd w:id="164"/>
-    <w:bookmarkStart w:id="165" w:name="hdcp-shows-unavailable"/>
+    <w:bookmarkEnd w:id="167"/>
+    <w:bookmarkStart w:id="168" w:name="hdcp-shows-unavailable"/>
     <w:p>
       <w:pPr>
         <w:pStyle w:val="Heading3"/>
@@ -11798,13 +12074,23 @@
         <w:t xml:space="preserve"> </w:t>
       </w:r>
       <w:r>
-        <w:t xml:space="preserve">Read the reason after the dash. For an ambiguous match, disconnect the identical monitor. For no answer</w:t>
-      </w:r>
-      <w:r>
-        <w:t xml:space="preserve"> </w:t>
-      </w:r>
-      <w:r>
-        <w:t xml:space="preserve">within the time limit, press</w:t>
+        <w:t xml:space="preserve">Expand</w:t>
+      </w:r>
+      <w:r>
+        <w:t xml:space="preserve"> </w:t>
+      </w:r>
+      <w:r>
+        <w:rPr>
+          <w:b/>
+          <w:bCs/>
+        </w:rPr>
+        <w:t xml:space="preserve">More Controls</w:t>
+      </w:r>
+      <w:r>
+        <w:t xml:space="preserve"> </w:t>
+      </w:r>
+      <w:r>
+        <w:t xml:space="preserve">and read the reason after the dash under</w:t>
       </w:r>
       <w:r>
         <w:t xml:space="preserve"> </w:t>
@@ -11820,6 +12106,34 @@
         <w:t xml:space="preserve"> </w:t>
       </w:r>
       <w:r>
+        <w:t xml:space="preserve">(also shown in the ⓘ popover;</w:t>
+      </w:r>
+      <w:r>
+        <w:t xml:space="preserve"> </w:t>
+      </w:r>
+      <w:r>
+        <w:t xml:space="preserve">the status line shows nothing when unavailable). For an ambiguous match, disconnect the identical monitor. For no</w:t>
+      </w:r>
+      <w:r>
+        <w:t xml:space="preserve"> </w:t>
+      </w:r>
+      <w:r>
+        <w:t xml:space="preserve">answer within the time limit, press</w:t>
+      </w:r>
+      <w:r>
+        <w:t xml:space="preserve"> </w:t>
+      </w:r>
+      <w:r>
+        <w:rPr>
+          <w:b/>
+          <w:bCs/>
+        </w:rPr>
+        <w:t xml:space="preserve">Check HDCP</w:t>
+      </w:r>
+      <w:r>
+        <w:t xml:space="preserve"> </w:t>
+      </w:r>
+      <w:r>
         <w:t xml:space="preserve">again once the display has settled.</w:t>
       </w:r>
       <w:r>
@@ -11836,17 +12150,23 @@
         <w:t xml:space="preserve"> </w:t>
       </w:r>
       <w:r>
-        <w:t xml:space="preserve">The reading could not be made: built-in display, identical monitors that cannot be told apart, a macOS</w:t>
-      </w:r>
-      <w:r>
-        <w:t xml:space="preserve"> </w:t>
-      </w:r>
-      <w:r>
-        <w:t xml:space="preserve">version without the status interface, a refused query, or a stalled answer. It is not a statement about the display.</w:t>
-      </w:r>
-    </w:p>
-    <w:bookmarkEnd w:id="165"/>
-    <w:bookmarkStart w:id="166" w:name="hdcp-shows-unprotected-or-negotiating"/>
+        <w:t xml:space="preserve">The reading could not be made: identical monitors that cannot be told apart, an Intel Mac (no display</w:t>
+      </w:r>
+      <w:r>
+        <w:t xml:space="preserve"> </w:t>
+      </w:r>
+      <w:r>
+        <w:t xml:space="preserve">service to query), a macOS version without the status interface, a refused query, a previous check still waiting</w:t>
+      </w:r>
+      <w:r>
+        <w:t xml:space="preserve"> </w:t>
+      </w:r>
+      <w:r>
+        <w:t xml:space="preserve">for macOS, or no answer within three seconds. It is not a statement about the display.</w:t>
+      </w:r>
+    </w:p>
+    <w:bookmarkEnd w:id="168"/>
+    <w:bookmarkStart w:id="169" w:name="hdcp-shows-unprotected-or-negotiating"/>
     <w:p>
       <w:pPr>
         <w:pStyle w:val="Heading3"/>
@@ -11923,11 +12243,11 @@
         <w:t xml:space="preserve"> </w:t>
       </w:r>
       <w:r>
-        <w:t xml:space="preserve">the topology sentence reports whether a repeater is present and any limit flags the receiver sets.</w:t>
-      </w:r>
-    </w:p>
-    <w:bookmarkEnd w:id="166"/>
-    <w:bookmarkStart w:id="167" w:name="no-rotation-or-underscan-row"/>
+        <w:t xml:space="preserve">on DisplayPort connections the topology sentence reports whether a repeater is present and, for an HDCP 2 repeater, any limit flags it sets.</w:t>
+      </w:r>
+    </w:p>
+    <w:bookmarkEnd w:id="169"/>
+    <w:bookmarkStart w:id="170" w:name="no-rotation-or-underscan-row"/>
     <w:p>
       <w:pPr>
         <w:pStyle w:val="Heading3"/>
@@ -11966,8 +12286,8 @@
         <w:t xml:space="preserve">monitor that can swivel exposes software rotation through this connection.</w:t>
       </w:r>
     </w:p>
-    <w:bookmarkEnd w:id="167"/>
-    <w:bookmarkStart w:id="168" w:name="X8d7085585af9f1b47330aa5031ccc1f3421da57"/>
+    <w:bookmarkEnd w:id="170"/>
+    <w:bookmarkStart w:id="171" w:name="X8d7085585af9f1b47330aa5031ccc1f3421da57"/>
     <w:p>
       <w:pPr>
         <w:pStyle w:val="Heading3"/>
@@ -12006,8 +12326,8 @@
         <w:t xml:space="preserve">Settings; the app will keep it and show it in the picker as the current size.</w:t>
       </w:r>
     </w:p>
-    <w:bookmarkEnd w:id="168"/>
-    <w:bookmarkStart w:id="169" w:name="a-custom-fix-does-not-appear"/>
+    <w:bookmarkEnd w:id="171"/>
+    <w:bookmarkStart w:id="172" w:name="a-custom-fix-does-not-appear"/>
     <w:p>
       <w:pPr>
         <w:pStyle w:val="Heading3"/>
@@ -12113,9 +12433,9 @@
         <w:t xml:space="preserve">line.</w:t>
       </w:r>
     </w:p>
-    <w:bookmarkEnd w:id="169"/>
-    <w:bookmarkEnd w:id="170"/>
-    <w:bookmarkStart w:id="175" w:name="errors-in-recent-events"/>
+    <w:bookmarkEnd w:id="172"/>
+    <w:bookmarkEnd w:id="173"/>
+    <w:bookmarkStart w:id="178" w:name="errors-in-recent-events"/>
     <w:p>
       <w:pPr>
         <w:pStyle w:val="Heading2"/>
@@ -12124,7 +12444,7 @@
         <w:t xml:space="preserve">Errors in Recent Events</w:t>
       </w:r>
     </w:p>
-    <w:bookmarkStart w:id="171" w:name="applyfailed-with-cgerror-1001"/>
+    <w:bookmarkStart w:id="174" w:name="applyfailed-with-cgerror-1001"/>
     <w:p>
       <w:pPr>
         <w:pStyle w:val="Heading3"/>
@@ -12185,8 +12505,8 @@
         <w:t xml:space="preserve">.</w:t>
       </w:r>
     </w:p>
-    <w:bookmarkEnd w:id="171"/>
-    <w:bookmarkStart w:id="172" w:name="applyfailed-with-cgerror-1007"/>
+    <w:bookmarkEnd w:id="174"/>
+    <w:bookmarkStart w:id="175" w:name="applyfailed-with-cgerror-1007"/>
     <w:p>
       <w:pPr>
         <w:pStyle w:val="Heading3"/>
@@ -12228,8 +12548,8 @@
         <w:t xml:space="preserve">a reconnect clears it.</w:t>
       </w:r>
     </w:p>
-    <w:bookmarkEnd w:id="172"/>
-    <w:bookmarkStart w:id="173" w:name="applyfailed-with-preset-mode-unavailable"/>
+    <w:bookmarkEnd w:id="175"/>
+    <w:bookmarkStart w:id="176" w:name="applyfailed-with-preset-mode-unavailable"/>
     <w:p>
       <w:pPr>
         <w:pStyle w:val="Heading3"/>
@@ -12277,8 +12597,8 @@
         <w:t xml:space="preserve">size the picker now hides). Pick a size once and the preset is replaced.</w:t>
       </w:r>
     </w:p>
-    <w:bookmarkEnd w:id="173"/>
-    <w:bookmarkStart w:id="174" w:name="scriptfailed"/>
+    <w:bookmarkEnd w:id="176"/>
+    <w:bookmarkStart w:id="177" w:name="scriptfailed"/>
     <w:p>
       <w:pPr>
         <w:pStyle w:val="Heading3"/>
@@ -12308,9 +12628,9 @@
         <w:t xml:space="preserve">A fix script exited non-zero. The detail holds the exit code and the last line of its output.</w:t>
       </w:r>
     </w:p>
-    <w:bookmarkEnd w:id="174"/>
-    <w:bookmarkEnd w:id="175"/>
-    <w:bookmarkStart w:id="179" w:name="the-app-itself"/>
+    <w:bookmarkEnd w:id="177"/>
+    <w:bookmarkEnd w:id="178"/>
+    <w:bookmarkStart w:id="182" w:name="the-app-itself"/>
     <w:p>
       <w:pPr>
         <w:pStyle w:val="Heading2"/>
@@ -12319,7 +12639,7 @@
         <w:t xml:space="preserve">The app itself</w:t>
       </w:r>
     </w:p>
-    <w:bookmarkStart w:id="176" w:name="X9b1f4ba64c8cc24cd6a73bb963e8fd140d5a5ad"/>
+    <w:bookmarkStart w:id="179" w:name="X9b1f4ba64c8cc24cd6a73bb963e8fd140d5a5ad"/>
     <w:p>
       <w:pPr>
         <w:pStyle w:val="Heading3"/>
@@ -12372,8 +12692,8 @@
         <w:t xml:space="preserve">WindowServer’s own display database is corrupt. The reset deletes it and macOS rebuilds it.</w:t>
       </w:r>
     </w:p>
-    <w:bookmarkEnd w:id="176"/>
-    <w:bookmarkStart w:id="177" w:name="the-icon-is-not-in-the-menu-bar"/>
+    <w:bookmarkEnd w:id="179"/>
+    <w:bookmarkStart w:id="180" w:name="the-icon-is-not-in-the-menu-bar"/>
     <w:p>
       <w:pPr>
         <w:pStyle w:val="Heading3"/>
@@ -12428,8 +12748,8 @@
         <w:t xml:space="preserve">was turned off, turn it back on in the menu.</w:t>
       </w:r>
     </w:p>
-    <w:bookmarkEnd w:id="177"/>
-    <w:bookmarkStart w:id="178" w:name="start-at-login-is-greyed"/>
+    <w:bookmarkEnd w:id="180"/>
+    <w:bookmarkStart w:id="181" w:name="start-at-login-is-greyed"/>
     <w:p>
       <w:pPr>
         <w:pStyle w:val="Heading3"/>
@@ -12468,9 +12788,9 @@
         <w:t xml:space="preserve">, where there is no login item to register.</w:t>
       </w:r>
     </w:p>
-    <w:bookmarkEnd w:id="178"/>
-    <w:bookmarkEnd w:id="179"/>
-    <w:bookmarkStart w:id="181" w:name="collecting-diagnostics-for-the-helpdesk"/>
+    <w:bookmarkEnd w:id="181"/>
+    <w:bookmarkEnd w:id="182"/>
+    <w:bookmarkStart w:id="184" w:name="collecting-diagnostics-for-the-helpdesk"/>
     <w:p>
       <w:pPr>
         <w:pStyle w:val="Heading2"/>
@@ -12494,7 +12814,13 @@
         <w:t xml:space="preserve"> </w:t>
       </w:r>
       <w:r>
-        <w:t xml:space="preserve">copies a local text report with app/macOS versions, display identities, modes, layout,</w:t>
+        <w:t xml:space="preserve">copies a local text report with app/macOS versions, display identities and macOS display UUIDs, modes, layout,</w:t>
+      </w:r>
+      <w:r>
+        <w:t xml:space="preserve"> </w:t>
+      </w:r>
+      <w:r>
+        <w:t xml:space="preserve">the active audio output with volume and mute, the last HDCP reading for each external display with raw values and any topology,</w:t>
       </w:r>
       <w:r>
         <w:t xml:space="preserve"> </w:t>
@@ -12901,7 +13227,7 @@
         <w:t xml:space="preserve">questions.</w:t>
       </w:r>
     </w:p>
-    <w:bookmarkStart w:id="180" w:name="X5e31aa226ff031c45db4ee0abd5206d87407bf1"/>
+    <w:bookmarkStart w:id="183" w:name="X5e31aa226ff031c45db4ee0abd5206d87407bf1"/>
     <w:p>
       <w:pPr>
         <w:pStyle w:val="Heading3"/>
@@ -13293,9 +13619,9 @@
         <w:t xml:space="preserve">that resets macOS display configuration.</w:t>
       </w:r>
     </w:p>
-    <w:bookmarkEnd w:id="180"/>
-    <w:bookmarkEnd w:id="181"/>
-    <w:bookmarkStart w:id="182" w:name="X6be06324594e8636178a21782f04ed856eaf899"/>
+    <w:bookmarkEnd w:id="183"/>
+    <w:bookmarkEnd w:id="184"/>
+    <w:bookmarkStart w:id="185" w:name="X6be06324594e8636178a21782f04ed856eaf899"/>
     <w:p>
       <w:pPr>
         <w:pStyle w:val="Heading2"/>
@@ -13342,8 +13668,8 @@
         <w:t xml:space="preserve">change if the installer reports that DisplayHelp could not close, quit the app, then rerun the installer.</w:t>
       </w:r>
     </w:p>
-    <w:bookmarkEnd w:id="182"/>
-    <w:bookmarkStart w:id="183" w:name="the-menu-looks-too-short"/>
+    <w:bookmarkEnd w:id="185"/>
+    <w:bookmarkStart w:id="186" w:name="the-menu-looks-too-short"/>
     <w:p>
       <w:pPr>
         <w:pStyle w:val="Heading2"/>
@@ -13372,8 +13698,8 @@
         <w:t xml:space="preserve">labeled with both screen numbers because both screens share a desktop.</w:t>
       </w:r>
     </w:p>
-    <w:bookmarkEnd w:id="183"/>
-    <w:bookmarkStart w:id="184" w:name="Xf9170cca88befcfcd23a9345b9e4a973df9f439"/>
+    <w:bookmarkEnd w:id="186"/>
+    <w:bookmarkStart w:id="187" w:name="Xf9170cca88befcfcd23a9345b9e4a973df9f439"/>
     <w:p>
       <w:pPr>
         <w:pStyle w:val="Heading2"/>
@@ -13403,8 +13729,8 @@
         <w:t xml:space="preserve">. Use Extend for independent desktops. Labels disappear after five seconds or a display-configuration change; click Identify Displays again to show them. The button appears beneath Screen Layout when an external display is detected. It does not request screen-recording access or capture desktop content.</w:t>
       </w:r>
     </w:p>
-    <w:bookmarkEnd w:id="184"/>
-    <w:bookmarkStart w:id="186" w:name="X5adf6dd4b75cee570ca37404475ada2ad2e72b3"/>
+    <w:bookmarkEnd w:id="187"/>
+    <w:bookmarkStart w:id="189" w:name="X5adf6dd4b75cee570ca37404475ada2ad2e72b3"/>
     <w:p>
       <w:pPr>
         <w:pStyle w:val="Heading2"/>
@@ -13453,7 +13779,7 @@
         <w:t xml:space="preserve">If an audio device changes while you adjust it, the app refuses the stale adjustment and asks you to use the newly selected output. Failed writes show the current readback and an explanation. No saved display profile is overwritten by an output-volume adjustment.</w:t>
       </w:r>
     </w:p>
-    <w:bookmarkStart w:id="185" w:name="placement-appears-reversed"/>
+    <w:bookmarkStart w:id="188" w:name="placement-appears-reversed"/>
     <w:p>
       <w:pPr>
         <w:pStyle w:val="Heading3"/>
@@ -13499,9 +13825,9 @@
         <w:t xml:space="preserve">, then alignment. Left on the built-in card means the opposite relationship. Check the visible readout and preview, then Keep Changes. For a failed move, share Copy Diagnostics immediately so its latest 20 events include the request and result.</w:t>
       </w:r>
     </w:p>
-    <w:bookmarkEnd w:id="185"/>
-    <w:bookmarkEnd w:id="186"/>
-    <w:bookmarkStart w:id="187" w:name="the-app-uses-an-unexpected-language"/>
+    <w:bookmarkEnd w:id="188"/>
+    <w:bookmarkEnd w:id="189"/>
+    <w:bookmarkStart w:id="190" w:name="the-app-uses-an-unexpected-language"/>
     <w:p>
       <w:pPr>
         <w:pStyle w:val="Heading2"/>
@@ -13562,7 +13888,7 @@
       <w:r>
         <w:t xml:space="preserve"> </w:t>
       </w:r>
-      <w:hyperlink r:id="rId137">
+      <w:hyperlink r:id="rId140">
         <w:r>
           <w:rPr>
             <w:rStyle w:val="Hyperlink"/>
@@ -13574,8 +13900,8 @@
         <w:t xml:space="preserve">. Choosing Later saves the selection but keeps the current process in its existing language until you quit and reopen DisplayHelp.</w:t>
       </w:r>
     </w:p>
-    <w:bookmarkEnd w:id="187"/>
-    <w:bookmarkEnd w:id="188"/>
+    <w:bookmarkEnd w:id="190"/>
+    <w:bookmarkEnd w:id="191"/>
     <w:sectPr>
       <w:footnotePr>
         <w:numRestart w:val="eachSect"/>

</xml_diff>